<commit_message>
reupload do caderno aberto
correções e formato diferente
</commit_message>
<xml_diff>
--- a/docs/acompanhamento/Caderno_Aberto_Projeto_Engenharia_Informatica.docx
+++ b/docs/acompanhamento/Caderno_Aberto_Projeto_Engenharia_Informatica.docx
@@ -35,19 +35,8 @@
           <w:sz w:val="33"/>
           <w:lang w:val="pt-PT"/>
         </w:rPr>
-        <w:t xml:space="preserve">Projeto de Engenharia </w:t>
+        <w:t>Projeto de Engenharia Informatica</w:t>
       </w:r>
-      <w:proofErr w:type="spellStart"/>
-      <w:r>
-        <w:rPr>
-          <w:b/>
-          <w:color w:val="1F4E79"/>
-          <w:sz w:val="33"/>
-          <w:lang w:val="pt-PT"/>
-        </w:rPr>
-        <w:t>Informatica</w:t>
-      </w:r>
-      <w:proofErr w:type="spellEnd"/>
     </w:p>
     <w:p>
       <w:pPr>
@@ -57,15 +46,6 @@
           <w:lang w:val="pt-PT"/>
         </w:rPr>
       </w:pPr>
-      <w:r>
-        <w:rPr>
-          <w:i/>
-          <w:color w:val="5F5F5F"/>
-          <w:sz w:val="20"/>
-          <w:lang w:val="pt-PT"/>
-        </w:rPr>
-        <w:t>Modelo semanal compacto para registo da atividade do grupo</w:t>
-      </w:r>
     </w:p>
     <w:tbl>
       <w:tblPr>
@@ -106,21 +86,12 @@
             <w:pPr>
               <w:spacing w:after="0"/>
             </w:pPr>
-            <w:proofErr w:type="spellStart"/>
             <w:r>
               <w:rPr>
                 <w:b/>
                 <w:color w:val="1F4E79"/>
               </w:rPr>
-              <w:t>Unidade</w:t>
-            </w:r>
-            <w:proofErr w:type="spellEnd"/>
-            <w:r>
-              <w:rPr>
-                <w:b/>
-                <w:color w:val="1F4E79"/>
-              </w:rPr>
-              <w:t xml:space="preserve"> Curricular</w:t>
+              <w:t>Unidade Curricular</w:t>
             </w:r>
           </w:p>
         </w:tc>
@@ -140,21 +111,8 @@
             <w:pPr>
               <w:spacing w:after="0"/>
             </w:pPr>
-            <w:proofErr w:type="spellStart"/>
-            <w:r>
-              <w:t>Projeto</w:t>
-            </w:r>
-            <w:proofErr w:type="spellEnd"/>
-            <w:r>
-              <w:t xml:space="preserve"> de </w:t>
-            </w:r>
-            <w:proofErr w:type="spellStart"/>
-            <w:r>
-              <w:t>Engenharia</w:t>
-            </w:r>
-            <w:proofErr w:type="spellEnd"/>
-            <w:r>
-              <w:t xml:space="preserve"> Informatica</w:t>
+            <w:r>
+              <w:t>Projeto de Engenharia Informatica</w:t>
             </w:r>
           </w:p>
         </w:tc>
@@ -179,7 +137,6 @@
             <w:pPr>
               <w:spacing w:after="0"/>
             </w:pPr>
-            <w:proofErr w:type="spellStart"/>
             <w:r>
               <w:rPr>
                 <w:b/>
@@ -187,7 +144,6 @@
               </w:rPr>
               <w:t>Projeto</w:t>
             </w:r>
-            <w:proofErr w:type="spellEnd"/>
           </w:p>
         </w:tc>
         <w:tc>
@@ -209,19 +165,11 @@
                 <w:lang w:val="pt-PT"/>
               </w:rPr>
             </w:pPr>
-            <w:proofErr w:type="spellStart"/>
             <w:r>
               <w:rPr>
                 <w:lang w:val="pt-PT"/>
               </w:rPr>
-              <w:t>Ramex-Rec</w:t>
-            </w:r>
-            <w:proofErr w:type="spellEnd"/>
-            <w:r>
-              <w:rPr>
-                <w:lang w:val="pt-PT"/>
-              </w:rPr>
-              <w:t>: Prot</w:t>
+              <w:t>Ramex-Rec: Prot</w:t>
             </w:r>
             <w:r>
               <w:rPr>
@@ -298,7 +246,6 @@
             <w:pPr>
               <w:spacing w:after="0"/>
             </w:pPr>
-            <w:proofErr w:type="spellStart"/>
             <w:r>
               <w:rPr>
                 <w:b/>
@@ -306,7 +253,6 @@
               </w:rPr>
               <w:t>Orientador</w:t>
             </w:r>
-            <w:proofErr w:type="spellEnd"/>
           </w:p>
         </w:tc>
         <w:tc>
@@ -357,31 +303,13 @@
             <w:pPr>
               <w:spacing w:after="0"/>
             </w:pPr>
-            <w:proofErr w:type="spellStart"/>
             <w:r>
               <w:rPr>
                 <w:b/>
                 <w:color w:val="1F4E79"/>
               </w:rPr>
-              <w:t>Elementos</w:t>
-            </w:r>
-            <w:proofErr w:type="spellEnd"/>
-            <w:r>
-              <w:rPr>
-                <w:b/>
-                <w:color w:val="1F4E79"/>
-              </w:rPr>
-              <w:t xml:space="preserve"> do </w:t>
-            </w:r>
-            <w:proofErr w:type="spellStart"/>
-            <w:r>
-              <w:rPr>
-                <w:b/>
-                <w:color w:val="1F4E79"/>
-              </w:rPr>
-              <w:t>grupo</w:t>
-            </w:r>
-            <w:proofErr w:type="spellEnd"/>
+              <w:t>Elementos do grupo</w:t>
+            </w:r>
           </w:p>
         </w:tc>
         <w:tc>
@@ -449,17 +377,8 @@
                 <w:b/>
                 <w:color w:val="1F4E79"/>
               </w:rPr>
-              <w:t xml:space="preserve">Ano </w:t>
-            </w:r>
-            <w:proofErr w:type="spellStart"/>
-            <w:r>
-              <w:rPr>
-                <w:b/>
-                <w:color w:val="1F4E79"/>
-              </w:rPr>
-              <w:t>letivo</w:t>
-            </w:r>
-            <w:proofErr w:type="spellEnd"/>
+              <w:t>Ano letivo</w:t>
+            </w:r>
           </w:p>
         </w:tc>
         <w:tc>
@@ -480,84 +399,6 @@
             </w:pPr>
             <w:r>
               <w:t>2025/2026</w:t>
-            </w:r>
-          </w:p>
-        </w:tc>
-      </w:tr>
-      <w:tr>
-        <w:trPr>
-          <w:jc w:val="center"/>
-        </w:trPr>
-        <w:tc>
-          <w:tcPr>
-            <w:tcW w:w="2381" w:type="dxa"/>
-            <w:shd w:val="clear" w:color="auto" w:fill="D9EAF7"/>
-            <w:tcMar>
-              <w:top w:w="55" w:type="dxa"/>
-              <w:left w:w="90" w:type="dxa"/>
-              <w:bottom w:w="55" w:type="dxa"/>
-              <w:right w:w="90" w:type="dxa"/>
-            </w:tcMar>
-            <w:vAlign w:val="center"/>
-          </w:tcPr>
-          <w:p>
-            <w:pPr>
-              <w:spacing w:after="0"/>
-            </w:pPr>
-            <w:proofErr w:type="spellStart"/>
-            <w:r>
-              <w:rPr>
-                <w:b/>
-                <w:color w:val="1F4E79"/>
-              </w:rPr>
-              <w:t>Observaçã</w:t>
-            </w:r>
-            <w:r>
-              <w:rPr>
-                <w:b/>
-                <w:color w:val="1F4E79"/>
-              </w:rPr>
-              <w:t>o</w:t>
-            </w:r>
-            <w:proofErr w:type="spellEnd"/>
-          </w:p>
-        </w:tc>
-        <w:tc>
-          <w:tcPr>
-            <w:tcW w:w="6690" w:type="dxa"/>
-            <w:shd w:val="clear" w:color="auto" w:fill="FFFFFF"/>
-            <w:tcMar>
-              <w:top w:w="55" w:type="dxa"/>
-              <w:left w:w="90" w:type="dxa"/>
-              <w:bottom w:w="55" w:type="dxa"/>
-              <w:right w:w="90" w:type="dxa"/>
-            </w:tcMar>
-            <w:vAlign w:val="center"/>
-          </w:tcPr>
-          <w:p>
-            <w:pPr>
-              <w:spacing w:after="0"/>
-              <w:rPr>
-                <w:lang w:val="pt-PT"/>
-              </w:rPr>
-            </w:pPr>
-            <w:r>
-              <w:rPr>
-                <w:lang w:val="pt-PT"/>
-              </w:rPr>
-              <w:t>Datas semanais indicativas, ajust</w:t>
-            </w:r>
-            <w:r>
-              <w:rPr>
-                <w:lang w:val="pt-PT"/>
-              </w:rPr>
-              <w:t>á</w:t>
-            </w:r>
-            <w:r>
-              <w:rPr>
-                <w:lang w:val="pt-PT"/>
-              </w:rPr>
-              <w:t>veis ao cronograma real.</w:t>
             </w:r>
           </w:p>
         </w:tc>
@@ -603,34 +444,19 @@
         <w:rPr>
           <w:lang w:val="pt-PT"/>
         </w:rPr>
-        <w:t>Este documento foi concebido para apoiar o registo semanal da atividade de cada elemento do grupo. Em cada semana, recomenda-se um registo breve do trabalho realizado, das dificuldades encontradas e das horas aproximadas dedicadas ao projeto.</w:t>
-      </w:r>
-    </w:p>
-    <w:p>
-      <w:pPr>
-        <w:spacing w:after="0"/>
-        <w:jc w:val="both"/>
-        <w:rPr>
-          <w:lang w:val="pt-PT"/>
-        </w:rPr>
-      </w:pPr>
-      <w:r>
-        <w:rPr>
-          <w:lang w:val="pt-PT"/>
-        </w:rPr>
-        <w:t>O modelo pode ser ajustado ao calend</w:t>
+        <w:t xml:space="preserve">Este documento foi concebido para apoiar o registo semanal da atividade de cada elemento do grupo. Em cada semana, </w:t>
       </w:r>
       <w:r>
         <w:rPr>
           <w:lang w:val="pt-PT"/>
         </w:rPr>
-        <w:t>á</w:t>
+        <w:t>faz-se</w:t>
       </w:r>
       <w:r>
         <w:rPr>
           <w:lang w:val="pt-PT"/>
         </w:rPr>
-        <w:t>rio real da unidade curricular e ao modo de trabalho do grupo.</w:t>
+        <w:t xml:space="preserve"> um registo breve do trabalho realizado, das dificuldades encontradas e das horas aproximadas dedicadas ao projeto.</w:t>
       </w:r>
     </w:p>
     <w:p>
@@ -662,50 +488,6 @@
         </w:rPr>
         <w:lastRenderedPageBreak/>
         <w:t>Registo Semanal</w:t>
-      </w:r>
-    </w:p>
-    <w:p>
-      <w:pPr>
-        <w:spacing w:after="80"/>
-        <w:rPr>
-          <w:lang w:val="pt-PT"/>
-        </w:rPr>
-      </w:pPr>
-      <w:r>
-        <w:rPr>
-          <w:lang w:val="pt-PT"/>
-        </w:rPr>
-        <w:t>Sugerem-se</w:t>
-      </w:r>
-      <w:r>
-        <w:rPr>
-          <w:lang w:val="pt-PT"/>
-        </w:rPr>
-        <w:t xml:space="preserve"> 2 a 3 linhas por elemento, com refer</w:t>
-      </w:r>
-      <w:r>
-        <w:rPr>
-          <w:lang w:val="pt-PT"/>
-        </w:rPr>
-        <w:t>ê</w:t>
-      </w:r>
-      <w:r>
-        <w:rPr>
-          <w:lang w:val="pt-PT"/>
-        </w:rPr>
-        <w:t xml:space="preserve">ncia a tarefas, </w:t>
-      </w:r>
-      <w:r>
-        <w:rPr>
-          <w:lang w:val="pt-PT"/>
-        </w:rPr>
-        <w:t>progresso, dificuldades e decisõ</w:t>
-      </w:r>
-      <w:r>
-        <w:rPr>
-          <w:lang w:val="pt-PT"/>
-        </w:rPr>
-        <w:t>es relevantes.</w:t>
       </w:r>
     </w:p>
     <w:p>
@@ -776,31 +558,13 @@
             <w:pPr>
               <w:spacing w:after="0"/>
             </w:pPr>
-            <w:proofErr w:type="spellStart"/>
             <w:r>
               <w:rPr>
                 <w:b/>
                 <w:color w:val="1F4E79"/>
               </w:rPr>
-              <w:t>Objetivo</w:t>
-            </w:r>
-            <w:proofErr w:type="spellEnd"/>
-            <w:r>
-              <w:rPr>
-                <w:b/>
-                <w:color w:val="1F4E79"/>
-              </w:rPr>
-              <w:t xml:space="preserve">(s) da </w:t>
-            </w:r>
-            <w:proofErr w:type="spellStart"/>
-            <w:r>
-              <w:rPr>
-                <w:b/>
-                <w:color w:val="1F4E79"/>
-              </w:rPr>
-              <w:t>semana</w:t>
-            </w:r>
-            <w:proofErr w:type="spellEnd"/>
+              <w:t>Objetivo(s) da semana</w:t>
+            </w:r>
           </w:p>
         </w:tc>
         <w:tc>
@@ -881,57 +645,39 @@
           <w:p>
             <w:pPr>
               <w:spacing w:after="0"/>
-            </w:pPr>
-            <w:r>
-              <w:rPr>
-                <w:b/>
+              <w:rPr>
                 <w:lang w:val="pt-PT"/>
               </w:rPr>
-              <w:t>Horas aproximadas: [</w:t>
-            </w:r>
-            <w:r>
-              <w:rPr>
-                <w:b/>
+            </w:pPr>
+            <w:r>
+              <w:rPr>
                 <w:lang w:val="pt-PT"/>
               </w:rPr>
+              <w:t xml:space="preserve">Horas aproximadas: </w:t>
+            </w:r>
+            <w:r>
+              <w:rPr>
+                <w:lang w:val="pt-PT"/>
+              </w:rPr>
               <w:t>7</w:t>
             </w:r>
             <w:r>
               <w:rPr>
-                <w:b/>
                 <w:lang w:val="pt-PT"/>
               </w:rPr>
-              <w:t>] horas</w:t>
-            </w:r>
-            <w:r>
-              <w:rPr>
-                <w:i/>
-                <w:color w:val="6E6E6E"/>
+              <w:t xml:space="preserve"> horas | </w:t>
+            </w:r>
+            <w:r>
+              <w:rPr>
                 <w:lang w:val="pt-PT"/>
               </w:rPr>
-              <w:t xml:space="preserve"> | </w:t>
+              <w:t xml:space="preserve">Leitura de documentação. </w:t>
             </w:r>
             <w:r>
               <w:rPr>
                 <w:lang w:val="pt-PT"/>
               </w:rPr>
-              <w:t xml:space="preserve">Leitura de documentação. </w:t>
-            </w:r>
-            <w:proofErr w:type="spellStart"/>
-            <w:r>
-              <w:t>Proposta</w:t>
-            </w:r>
-            <w:proofErr w:type="spellEnd"/>
-            <w:r>
-              <w:t xml:space="preserve"> </w:t>
-            </w:r>
-            <w:proofErr w:type="spellStart"/>
-            <w:r>
-              <w:t>inicial</w:t>
-            </w:r>
-            <w:proofErr w:type="spellEnd"/>
-            <w:r>
-              <w:t>.</w:t>
+              <w:t>Proposta inicial.</w:t>
             </w:r>
           </w:p>
         </w:tc>
@@ -987,35 +733,27 @@
           <w:p>
             <w:pPr>
               <w:spacing w:after="0"/>
-            </w:pPr>
-            <w:r>
-              <w:rPr>
-                <w:b/>
+              <w:rPr>
                 <w:lang w:val="pt-PT"/>
               </w:rPr>
-              <w:t>Horas aproximadas: [</w:t>
-            </w:r>
-            <w:r>
-              <w:rPr>
-                <w:b/>
+            </w:pPr>
+            <w:r>
+              <w:rPr>
                 <w:lang w:val="pt-PT"/>
               </w:rPr>
+              <w:t xml:space="preserve">Horas aproximadas: </w:t>
+            </w:r>
+            <w:r>
+              <w:rPr>
+                <w:lang w:val="pt-PT"/>
+              </w:rPr>
               <w:t>7</w:t>
             </w:r>
             <w:r>
               <w:rPr>
-                <w:b/>
                 <w:lang w:val="pt-PT"/>
               </w:rPr>
-              <w:t>] horas</w:t>
-            </w:r>
-            <w:r>
-              <w:rPr>
-                <w:i/>
-                <w:color w:val="6E6E6E"/>
-                <w:lang w:val="pt-PT"/>
-              </w:rPr>
-              <w:t xml:space="preserve"> | </w:t>
+              <w:t xml:space="preserve"> horas | </w:t>
             </w:r>
             <w:r>
               <w:rPr>
@@ -1036,21 +774,11 @@
               </w:rPr>
               <w:t xml:space="preserve">o. </w:t>
             </w:r>
-            <w:proofErr w:type="spellStart"/>
-            <w:r>
-              <w:t>Proposta</w:t>
-            </w:r>
-            <w:proofErr w:type="spellEnd"/>
-            <w:r>
-              <w:t xml:space="preserve"> </w:t>
-            </w:r>
-            <w:proofErr w:type="spellStart"/>
-            <w:r>
-              <w:t>inicial</w:t>
-            </w:r>
-            <w:proofErr w:type="spellEnd"/>
-            <w:r>
-              <w:t>.</w:t>
+            <w:r>
+              <w:rPr>
+                <w:lang w:val="pt-PT"/>
+              </w:rPr>
+              <w:t>Proposta inicial.</w:t>
             </w:r>
           </w:p>
         </w:tc>
@@ -1099,28 +827,21 @@
           <w:p>
             <w:pPr>
               <w:spacing w:after="0"/>
-            </w:pPr>
-            <w:r>
-              <w:rPr>
-                <w:b/>
+              <w:rPr>
                 <w:lang w:val="pt-PT"/>
               </w:rPr>
-              <w:t>Horas aproximadas: [7</w:t>
-            </w:r>
-            <w:r>
-              <w:rPr>
-                <w:b/>
+            </w:pPr>
+            <w:r>
+              <w:rPr>
                 <w:lang w:val="pt-PT"/>
               </w:rPr>
-              <w:t>] horas</w:t>
-            </w:r>
-            <w:r>
-              <w:rPr>
-                <w:i/>
-                <w:color w:val="6E6E6E"/>
+              <w:t>Horas aproximadas: 7</w:t>
+            </w:r>
+            <w:r>
+              <w:rPr>
                 <w:lang w:val="pt-PT"/>
               </w:rPr>
-              <w:t xml:space="preserve"> | </w:t>
+              <w:t xml:space="preserve"> horas | </w:t>
             </w:r>
             <w:r>
               <w:rPr>
@@ -1141,21 +862,11 @@
               </w:rPr>
               <w:t xml:space="preserve">o. </w:t>
             </w:r>
-            <w:proofErr w:type="spellStart"/>
-            <w:r>
-              <w:t>Proposta</w:t>
-            </w:r>
-            <w:proofErr w:type="spellEnd"/>
-            <w:r>
-              <w:t xml:space="preserve"> </w:t>
-            </w:r>
-            <w:proofErr w:type="spellStart"/>
-            <w:r>
-              <w:t>inicial</w:t>
-            </w:r>
-            <w:proofErr w:type="spellEnd"/>
-            <w:r>
-              <w:t>.</w:t>
+            <w:r>
+              <w:rPr>
+                <w:lang w:val="pt-PT"/>
+              </w:rPr>
+              <w:t>Proposta inicial.</w:t>
             </w:r>
           </w:p>
         </w:tc>
@@ -1180,31 +891,13 @@
             <w:pPr>
               <w:spacing w:after="0"/>
             </w:pPr>
-            <w:proofErr w:type="spellStart"/>
             <w:r>
               <w:rPr>
                 <w:b/>
                 <w:color w:val="1F4E79"/>
               </w:rPr>
-              <w:t>Sintese</w:t>
-            </w:r>
-            <w:proofErr w:type="spellEnd"/>
-            <w:r>
-              <w:rPr>
-                <w:b/>
-                <w:color w:val="1F4E79"/>
-              </w:rPr>
-              <w:t xml:space="preserve"> do </w:t>
-            </w:r>
-            <w:proofErr w:type="spellStart"/>
-            <w:r>
-              <w:rPr>
-                <w:b/>
-                <w:color w:val="1F4E79"/>
-              </w:rPr>
-              <w:t>grupo</w:t>
-            </w:r>
-            <w:proofErr w:type="spellEnd"/>
+              <w:t>Sintese do grupo</w:t>
+            </w:r>
           </w:p>
         </w:tc>
         <w:tc>
@@ -1261,31 +954,20 @@
             <w:pPr>
               <w:spacing w:after="0"/>
             </w:pPr>
-            <w:proofErr w:type="spellStart"/>
             <w:r>
               <w:rPr>
                 <w:b/>
                 <w:color w:val="1F4E79"/>
               </w:rPr>
-              <w:t>Próxima</w:t>
-            </w:r>
-            <w:proofErr w:type="spellEnd"/>
+              <w:t xml:space="preserve">Próxima </w:t>
+            </w:r>
             <w:r>
               <w:rPr>
                 <w:b/>
                 <w:color w:val="1F4E79"/>
               </w:rPr>
-              <w:t xml:space="preserve"> </w:t>
-            </w:r>
-            <w:proofErr w:type="spellStart"/>
-            <w:r>
-              <w:rPr>
-                <w:b/>
-                <w:color w:val="1F4E79"/>
-              </w:rPr>
               <w:t>semana</w:t>
             </w:r>
-            <w:proofErr w:type="spellEnd"/>
           </w:p>
         </w:tc>
         <w:tc>
@@ -1397,31 +1079,13 @@
             <w:pPr>
               <w:spacing w:after="0"/>
             </w:pPr>
-            <w:proofErr w:type="spellStart"/>
             <w:r>
               <w:rPr>
                 <w:b/>
                 <w:color w:val="1F4E79"/>
               </w:rPr>
-              <w:t>Objetivo</w:t>
-            </w:r>
-            <w:proofErr w:type="spellEnd"/>
-            <w:r>
-              <w:rPr>
-                <w:b/>
-                <w:color w:val="1F4E79"/>
-              </w:rPr>
-              <w:t xml:space="preserve">(s) da </w:t>
-            </w:r>
-            <w:proofErr w:type="spellStart"/>
-            <w:r>
-              <w:rPr>
-                <w:b/>
-                <w:color w:val="1F4E79"/>
-              </w:rPr>
-              <w:t>semana</w:t>
-            </w:r>
-            <w:proofErr w:type="spellEnd"/>
+              <w:t>Objetivo(s) da semana</w:t>
+            </w:r>
           </w:p>
         </w:tc>
         <w:tc>
@@ -1437,7 +1101,15 @@
             <w:vAlign w:val="center"/>
           </w:tcPr>
           <w:p>
-            <w:r>
+            <w:pPr>
+              <w:rPr>
+                <w:lang w:val="pt-PT"/>
+              </w:rPr>
+            </w:pPr>
+            <w:r>
+              <w:rPr>
+                <w:lang w:val="pt-PT"/>
+              </w:rPr>
               <w:t>Iniciar a implementação do protótipo, organizar a divisão de tarefas e estruturar o repositório de trabalho.</w:t>
             </w:r>
           </w:p>
@@ -1485,7 +1157,15 @@
             <w:vAlign w:val="center"/>
           </w:tcPr>
           <w:p>
-            <w:r>
+            <w:pPr>
+              <w:rPr>
+                <w:lang w:val="pt-PT"/>
+              </w:rPr>
+            </w:pPr>
+            <w:r>
+              <w:rPr>
+                <w:lang w:val="pt-PT"/>
+              </w:rPr>
               <w:t>Horas aproximadas: 6 horas | Leitura complementar da documentação, análise da estrutura global do projeto e apoio na organização inicial do trabalho.</w:t>
             </w:r>
           </w:p>
@@ -1540,7 +1220,15 @@
             <w:vAlign w:val="center"/>
           </w:tcPr>
           <w:p>
-            <w:r>
+            <w:pPr>
+              <w:rPr>
+                <w:lang w:val="pt-PT"/>
+              </w:rPr>
+            </w:pPr>
+            <w:r>
+              <w:rPr>
+                <w:lang w:val="pt-PT"/>
+              </w:rPr>
               <w:t>Horas aproximadas: 6 horas | Participação na análise inicial do problema e na discussão da abordagem a seguir para os datasets fornecidos.</w:t>
             </w:r>
           </w:p>
@@ -1588,7 +1276,15 @@
             <w:vAlign w:val="center"/>
           </w:tcPr>
           <w:p>
-            <w:r>
+            <w:pPr>
+              <w:rPr>
+                <w:lang w:val="pt-PT"/>
+              </w:rPr>
+            </w:pPr>
+            <w:r>
+              <w:rPr>
+                <w:lang w:val="pt-PT"/>
+              </w:rPr>
               <w:t>Horas aproximadas: 8 horas | Início da componente de implementação, com preparação dos primeiros scripts e exploração da estrutura dos datasets.</w:t>
             </w:r>
           </w:p>
@@ -1614,31 +1310,13 @@
             <w:pPr>
               <w:spacing w:after="0"/>
             </w:pPr>
-            <w:proofErr w:type="spellStart"/>
             <w:r>
               <w:rPr>
                 <w:b/>
                 <w:color w:val="1F4E79"/>
               </w:rPr>
-              <w:t>Sintese</w:t>
-            </w:r>
-            <w:proofErr w:type="spellEnd"/>
-            <w:r>
-              <w:rPr>
-                <w:b/>
-                <w:color w:val="1F4E79"/>
-              </w:rPr>
-              <w:t xml:space="preserve"> do </w:t>
-            </w:r>
-            <w:proofErr w:type="spellStart"/>
-            <w:r>
-              <w:rPr>
-                <w:b/>
-                <w:color w:val="1F4E79"/>
-              </w:rPr>
-              <w:t>grupo</w:t>
-            </w:r>
-            <w:proofErr w:type="spellEnd"/>
+              <w:t>Sintese do grupo</w:t>
+            </w:r>
           </w:p>
         </w:tc>
         <w:tc>
@@ -1654,7 +1332,15 @@
             <w:vAlign w:val="center"/>
           </w:tcPr>
           <w:p>
-            <w:r>
+            <w:pPr>
+              <w:rPr>
+                <w:lang w:val="pt-PT"/>
+              </w:rPr>
+            </w:pPr>
+            <w:r>
+              <w:rPr>
+                <w:lang w:val="pt-PT"/>
+              </w:rPr>
               <w:t>O grupo avançou da fase de leitura para uma fase inicial de implementação. Foram discutidas a organização do trabalho, a divisão de tarefas e a abordagem a adotar para os datasets fornecidos.</w:t>
             </w:r>
           </w:p>
@@ -1680,31 +1366,20 @@
             <w:pPr>
               <w:spacing w:after="0"/>
             </w:pPr>
-            <w:proofErr w:type="spellStart"/>
             <w:r>
               <w:rPr>
                 <w:b/>
                 <w:color w:val="1F4E79"/>
               </w:rPr>
-              <w:t>Próxima</w:t>
-            </w:r>
-            <w:proofErr w:type="spellEnd"/>
+              <w:t xml:space="preserve">Próxima </w:t>
+            </w:r>
             <w:r>
               <w:rPr>
                 <w:b/>
                 <w:color w:val="1F4E79"/>
               </w:rPr>
-              <w:t xml:space="preserve"> </w:t>
-            </w:r>
-            <w:proofErr w:type="spellStart"/>
-            <w:r>
-              <w:rPr>
-                <w:b/>
-                <w:color w:val="1F4E79"/>
-              </w:rPr>
               <w:t>semana</w:t>
             </w:r>
-            <w:proofErr w:type="spellEnd"/>
           </w:p>
         </w:tc>
         <w:tc>
@@ -1720,7 +1395,15 @@
             <w:vAlign w:val="center"/>
           </w:tcPr>
           <w:p>
-            <w:r>
+            <w:pPr>
+              <w:rPr>
+                <w:lang w:val="pt-PT"/>
+              </w:rPr>
+            </w:pPr>
+            <w:r>
+              <w:rPr>
+                <w:lang w:val="pt-PT"/>
+              </w:rPr>
               <w:t>Prosseguir a implementação dos scripts de pré-tratamento e aprofundar a análise da natureza de cada dataset.</w:t>
             </w:r>
           </w:p>
@@ -1730,6 +1413,9 @@
     <w:p>
       <w:pPr>
         <w:spacing w:after="10"/>
+        <w:rPr>
+          <w:lang w:val="pt-PT"/>
+        </w:rPr>
       </w:pPr>
     </w:p>
     <w:p>
@@ -1792,31 +1478,13 @@
             <w:pPr>
               <w:spacing w:after="0"/>
             </w:pPr>
-            <w:proofErr w:type="spellStart"/>
             <w:r>
               <w:rPr>
                 <w:b/>
                 <w:color w:val="1F4E79"/>
               </w:rPr>
-              <w:t>Objetivo</w:t>
-            </w:r>
-            <w:proofErr w:type="spellEnd"/>
-            <w:r>
-              <w:rPr>
-                <w:b/>
-                <w:color w:val="1F4E79"/>
-              </w:rPr>
-              <w:t xml:space="preserve">(s) da </w:t>
-            </w:r>
-            <w:proofErr w:type="spellStart"/>
-            <w:r>
-              <w:rPr>
-                <w:b/>
-                <w:color w:val="1F4E79"/>
-              </w:rPr>
-              <w:t>semana</w:t>
-            </w:r>
-            <w:proofErr w:type="spellEnd"/>
+              <w:t>Objetivo(s) da semana</w:t>
+            </w:r>
           </w:p>
         </w:tc>
         <w:tc>
@@ -1832,7 +1500,15 @@
             <w:vAlign w:val="center"/>
           </w:tcPr>
           <w:p>
-            <w:r>
+            <w:pPr>
+              <w:rPr>
+                <w:lang w:val="pt-PT"/>
+              </w:rPr>
+            </w:pPr>
+            <w:r>
+              <w:rPr>
+                <w:lang w:val="pt-PT"/>
+              </w:rPr>
               <w:t>Desenvolver scripts de pré-tratamento dos datasets e comparar a sua estrutura e potencial de extração de padrões.</w:t>
             </w:r>
           </w:p>
@@ -1880,7 +1556,15 @@
             <w:vAlign w:val="center"/>
           </w:tcPr>
           <w:p>
-            <w:r>
+            <w:pPr>
+              <w:rPr>
+                <w:lang w:val="pt-PT"/>
+              </w:rPr>
+            </w:pPr>
+            <w:r>
+              <w:rPr>
+                <w:lang w:val="pt-PT"/>
+              </w:rPr>
               <w:t>Horas aproximadas: 6 horas | Acompanhamento da evolução do projeto, análise dos resultados intermédios e reflexão sobre a organização futura do trabalho e da apresentação.</w:t>
             </w:r>
           </w:p>
@@ -1935,7 +1619,15 @@
             <w:vAlign w:val="center"/>
           </w:tcPr>
           <w:p>
-            <w:r>
+            <w:pPr>
+              <w:rPr>
+                <w:lang w:val="pt-PT"/>
+              </w:rPr>
+            </w:pPr>
+            <w:r>
+              <w:rPr>
+                <w:lang w:val="pt-PT"/>
+              </w:rPr>
               <w:t>Horas aproximadas: 6 horas | Apoio na validação da abordagem seguida e discussão dos resultados obtidos com os primeiros tratamentos de dados.</w:t>
             </w:r>
           </w:p>
@@ -1983,7 +1675,15 @@
             <w:vAlign w:val="center"/>
           </w:tcPr>
           <w:p>
-            <w:r>
+            <w:pPr>
+              <w:rPr>
+                <w:lang w:val="pt-PT"/>
+              </w:rPr>
+            </w:pPr>
+            <w:r>
+              <w:rPr>
+                <w:lang w:val="pt-PT"/>
+              </w:rPr>
               <w:t>Horas aproximadas: 9 horas | Desenvolvimento dos scripts de pré-tratamento para os datasets e teste das primeiras transformações necessárias à análise sequencial.</w:t>
             </w:r>
           </w:p>
@@ -2009,31 +1709,14 @@
             <w:pPr>
               <w:spacing w:after="0"/>
             </w:pPr>
-            <w:proofErr w:type="spellStart"/>
             <w:r>
               <w:rPr>
                 <w:b/>
                 <w:color w:val="1F4E79"/>
               </w:rPr>
-              <w:t>Sintese</w:t>
-            </w:r>
-            <w:proofErr w:type="spellEnd"/>
-            <w:r>
-              <w:rPr>
-                <w:b/>
-                <w:color w:val="1F4E79"/>
-              </w:rPr>
-              <w:t xml:space="preserve"> do </w:t>
-            </w:r>
-            <w:proofErr w:type="spellStart"/>
-            <w:r>
-              <w:rPr>
-                <w:b/>
-                <w:color w:val="1F4E79"/>
-              </w:rPr>
-              <w:t>grupo</w:t>
-            </w:r>
-            <w:proofErr w:type="spellEnd"/>
+              <w:lastRenderedPageBreak/>
+              <w:t>Sintese do grupo</w:t>
+            </w:r>
           </w:p>
         </w:tc>
         <w:tc>
@@ -2049,7 +1732,15 @@
             <w:vAlign w:val="center"/>
           </w:tcPr>
           <w:p>
-            <w:r>
+            <w:pPr>
+              <w:rPr>
+                <w:lang w:val="pt-PT"/>
+              </w:rPr>
+            </w:pPr>
+            <w:r>
+              <w:rPr>
+                <w:lang w:val="pt-PT"/>
+              </w:rPr>
               <w:t>Foram desenvolvidos e testados os primeiros scripts de pré-tratamento dos datasets. Tornou-se mais evidente que a natureza dos dados influencia diretamente a capacidade de identificar padrões relevantes.</w:t>
             </w:r>
           </w:p>
@@ -2075,31 +1766,20 @@
             <w:pPr>
               <w:spacing w:after="0"/>
             </w:pPr>
-            <w:proofErr w:type="spellStart"/>
             <w:r>
               <w:rPr>
                 <w:b/>
                 <w:color w:val="1F4E79"/>
               </w:rPr>
-              <w:t>Próxima</w:t>
-            </w:r>
-            <w:proofErr w:type="spellEnd"/>
+              <w:t xml:space="preserve">Próxima </w:t>
+            </w:r>
             <w:r>
               <w:rPr>
                 <w:b/>
                 <w:color w:val="1F4E79"/>
               </w:rPr>
-              <w:t xml:space="preserve"> </w:t>
-            </w:r>
-            <w:proofErr w:type="spellStart"/>
-            <w:r>
-              <w:rPr>
-                <w:b/>
-                <w:color w:val="1F4E79"/>
-              </w:rPr>
               <w:t>semana</w:t>
             </w:r>
-            <w:proofErr w:type="spellEnd"/>
           </w:p>
         </w:tc>
         <w:tc>
@@ -2115,7 +1795,15 @@
             <w:vAlign w:val="center"/>
           </w:tcPr>
           <w:p>
-            <w:r>
+            <w:pPr>
+              <w:rPr>
+                <w:lang w:val="pt-PT"/>
+              </w:rPr>
+            </w:pPr>
+            <w:r>
+              <w:rPr>
+                <w:lang w:val="pt-PT"/>
+              </w:rPr>
               <w:t>Avançar para a criação de pares, contagem de frequências e primeiras representações estruturadas dos dados.</w:t>
             </w:r>
           </w:p>
@@ -2124,13 +1812,10 @@
     </w:tbl>
     <w:p>
       <w:pPr>
-        <w:spacing w:after="10"/>
+        <w:rPr>
+          <w:lang w:val="pt-PT"/>
+        </w:rPr>
       </w:pPr>
-    </w:p>
-    <w:p>
-      <w:r>
-        <w:br w:type="page"/>
-      </w:r>
     </w:p>
     <w:p>
       <w:pPr>
@@ -2142,7 +1827,6 @@
           <w:color w:val="1F4E79"/>
           <w:sz w:val="21"/>
         </w:rPr>
-        <w:lastRenderedPageBreak/>
         <w:t>Semana 4</w:t>
       </w:r>
       <w:r>
@@ -2193,31 +1877,13 @@
             <w:pPr>
               <w:spacing w:after="0"/>
             </w:pPr>
-            <w:proofErr w:type="spellStart"/>
             <w:r>
               <w:rPr>
                 <w:b/>
                 <w:color w:val="1F4E79"/>
               </w:rPr>
-              <w:t>Objetivo</w:t>
-            </w:r>
-            <w:proofErr w:type="spellEnd"/>
-            <w:r>
-              <w:rPr>
-                <w:b/>
-                <w:color w:val="1F4E79"/>
-              </w:rPr>
-              <w:t xml:space="preserve">(s) da </w:t>
-            </w:r>
-            <w:proofErr w:type="spellStart"/>
-            <w:r>
-              <w:rPr>
-                <w:b/>
-                <w:color w:val="1F4E79"/>
-              </w:rPr>
-              <w:t>semana</w:t>
-            </w:r>
-            <w:proofErr w:type="spellEnd"/>
+              <w:t>Objetivo(s) da semana</w:t>
+            </w:r>
           </w:p>
         </w:tc>
         <w:tc>
@@ -2233,7 +1899,15 @@
             <w:vAlign w:val="center"/>
           </w:tcPr>
           <w:p>
-            <w:r>
+            <w:pPr>
+              <w:rPr>
+                <w:lang w:val="pt-PT"/>
+              </w:rPr>
+            </w:pPr>
+            <w:r>
+              <w:rPr>
+                <w:lang w:val="pt-PT"/>
+              </w:rPr>
               <w:t>Consolidar os scripts já produzidos, analisar resultados preliminares e preparar a reunião com o orientador.</w:t>
             </w:r>
           </w:p>
@@ -2281,7 +1955,15 @@
             <w:vAlign w:val="center"/>
           </w:tcPr>
           <w:p>
-            <w:r>
+            <w:pPr>
+              <w:rPr>
+                <w:lang w:val="pt-PT"/>
+              </w:rPr>
+            </w:pPr>
+            <w:r>
+              <w:rPr>
+                <w:lang w:val="pt-PT"/>
+              </w:rPr>
               <w:t>Horas aproximadas: 7 horas | Análise do código já desenvolvido, sem introdução de alterações nesta fase, e preparação do material de apoio à reunião, incluindo slides e atualização do Caderno Aberto.</w:t>
             </w:r>
           </w:p>
@@ -2336,7 +2018,15 @@
             <w:vAlign w:val="center"/>
           </w:tcPr>
           <w:p>
-            <w:r>
+            <w:pPr>
+              <w:rPr>
+                <w:lang w:val="pt-PT"/>
+              </w:rPr>
+            </w:pPr>
+            <w:r>
+              <w:rPr>
+                <w:lang w:val="pt-PT"/>
+              </w:rPr>
               <w:t>Horas aproximadas: 6 horas | Acompanhamento da evolução do trabalho, discussão da interpretação dos resultados preliminares e preparação para o ponto de situação com o orientador.</w:t>
             </w:r>
           </w:p>
@@ -2384,7 +2074,15 @@
             <w:vAlign w:val="center"/>
           </w:tcPr>
           <w:p>
-            <w:r>
+            <w:pPr>
+              <w:rPr>
+                <w:lang w:val="pt-PT"/>
+              </w:rPr>
+            </w:pPr>
+            <w:r>
+              <w:rPr>
+                <w:lang w:val="pt-PT"/>
+              </w:rPr>
               <w:t>Horas aproximadas: 10 horas | Continuação da implementação dos scripts, nomeadamente na criação de pares e no avanço para matriz de adjacência e análise mais estruturada.</w:t>
             </w:r>
           </w:p>
@@ -2410,31 +2108,13 @@
             <w:pPr>
               <w:spacing w:after="0"/>
             </w:pPr>
-            <w:proofErr w:type="spellStart"/>
             <w:r>
               <w:rPr>
                 <w:b/>
                 <w:color w:val="1F4E79"/>
               </w:rPr>
-              <w:t>Sintese</w:t>
-            </w:r>
-            <w:proofErr w:type="spellEnd"/>
-            <w:r>
-              <w:rPr>
-                <w:b/>
-                <w:color w:val="1F4E79"/>
-              </w:rPr>
-              <w:t xml:space="preserve"> do </w:t>
-            </w:r>
-            <w:proofErr w:type="spellStart"/>
-            <w:r>
-              <w:rPr>
-                <w:b/>
-                <w:color w:val="1F4E79"/>
-              </w:rPr>
-              <w:t>grupo</w:t>
-            </w:r>
-            <w:proofErr w:type="spellEnd"/>
+              <w:t>Sintese do grupo</w:t>
+            </w:r>
           </w:p>
         </w:tc>
         <w:tc>
@@ -2450,7 +2130,15 @@
             <w:vAlign w:val="center"/>
           </w:tcPr>
           <w:p>
-            <w:r>
+            <w:pPr>
+              <w:rPr>
+                <w:lang w:val="pt-PT"/>
+              </w:rPr>
+            </w:pPr>
+            <w:r>
+              <w:rPr>
+                <w:lang w:val="pt-PT"/>
+              </w:rPr>
               <w:t>Nesta semana consolidou-se o trabalho já realizado e preparou-se o ponto de situação para apresentar ao Professor. Os resultados preliminares mostram diferenças relevantes entre os datasets e reforçam a necessidade de estruturar a análise numa lógica comum.</w:t>
             </w:r>
           </w:p>
@@ -2476,31 +2164,20 @@
             <w:pPr>
               <w:spacing w:after="0"/>
             </w:pPr>
-            <w:proofErr w:type="spellStart"/>
             <w:r>
               <w:rPr>
                 <w:b/>
                 <w:color w:val="1F4E79"/>
               </w:rPr>
-              <w:t>Próxima</w:t>
-            </w:r>
-            <w:proofErr w:type="spellEnd"/>
+              <w:t xml:space="preserve">Próxima </w:t>
+            </w:r>
             <w:r>
               <w:rPr>
                 <w:b/>
                 <w:color w:val="1F4E79"/>
               </w:rPr>
-              <w:t xml:space="preserve"> </w:t>
-            </w:r>
-            <w:proofErr w:type="spellStart"/>
-            <w:r>
-              <w:rPr>
-                <w:b/>
-                <w:color w:val="1F4E79"/>
-              </w:rPr>
               <w:t>semana</w:t>
             </w:r>
-            <w:proofErr w:type="spellEnd"/>
           </w:p>
         </w:tc>
         <w:tc>
@@ -2516,7 +2193,15 @@
             <w:vAlign w:val="center"/>
           </w:tcPr>
           <w:p>
-            <w:r>
+            <w:pPr>
+              <w:rPr>
+                <w:lang w:val="pt-PT"/>
+              </w:rPr>
+            </w:pPr>
+            <w:r>
+              <w:rPr>
+                <w:lang w:val="pt-PT"/>
+              </w:rPr>
               <w:t>Apresentar o ponto de situação ao orientador, recolher feedback e avançar para uma organização mais modular da solução.</w:t>
             </w:r>
           </w:p>
@@ -2526,6 +2211,9 @@
     <w:p>
       <w:pPr>
         <w:spacing w:after="10"/>
+        <w:rPr>
+          <w:lang w:val="pt-PT"/>
+        </w:rPr>
       </w:pPr>
     </w:p>
     <w:p>
@@ -2596,31 +2284,13 @@
             <w:pPr>
               <w:spacing w:after="0"/>
             </w:pPr>
-            <w:proofErr w:type="spellStart"/>
             <w:r>
               <w:rPr>
                 <w:b/>
                 <w:color w:val="1F4E79"/>
               </w:rPr>
-              <w:t>Objetivo</w:t>
-            </w:r>
-            <w:proofErr w:type="spellEnd"/>
-            <w:r>
-              <w:rPr>
-                <w:b/>
-                <w:color w:val="1F4E79"/>
-              </w:rPr>
-              <w:t xml:space="preserve">(s) da </w:t>
-            </w:r>
-            <w:proofErr w:type="spellStart"/>
-            <w:r>
-              <w:rPr>
-                <w:b/>
-                <w:color w:val="1F4E79"/>
-              </w:rPr>
-              <w:t>semana</w:t>
-            </w:r>
-            <w:proofErr w:type="spellEnd"/>
+              <w:t>Objetivo(s) da semana</w:t>
+            </w:r>
           </w:p>
         </w:tc>
         <w:tc>
@@ -2636,7 +2306,15 @@
             <w:vAlign w:val="center"/>
           </w:tcPr>
           <w:p>
-            <w:r>
+            <w:pPr>
+              <w:rPr>
+                <w:lang w:val="pt-PT"/>
+              </w:rPr>
+            </w:pPr>
+            <w:r>
+              <w:rPr>
+                <w:lang w:val="pt-PT"/>
+              </w:rPr>
               <w:t>Preparar a reunião de acompanhamento, atualizar a documentação do projeto e consolidar a estrutura atual do repositório.</w:t>
             </w:r>
           </w:p>
@@ -2684,8 +2362,28 @@
             <w:vAlign w:val="center"/>
           </w:tcPr>
           <w:p>
-            <w:r>
-              <w:t>Horas aproximadas: 8 horas (até ao momento) | Revisão do clone atualizado, atualização do README, do .gitignore e de scripts genéricos, além da preparação dos slides e da atualização do Caderno Aberto.</w:t>
+            <w:pPr>
+              <w:rPr>
+                <w:lang w:val="pt-PT"/>
+              </w:rPr>
+            </w:pPr>
+            <w:r>
+              <w:rPr>
+                <w:lang w:val="pt-PT"/>
+              </w:rPr>
+              <w:t xml:space="preserve">Horas aproximadas: </w:t>
+            </w:r>
+            <w:r>
+              <w:rPr>
+                <w:lang w:val="pt-PT"/>
+              </w:rPr>
+              <w:t>7</w:t>
+            </w:r>
+            <w:r>
+              <w:rPr>
+                <w:lang w:val="pt-PT"/>
+              </w:rPr>
+              <w:t xml:space="preserve"> horas (até ao momento) | Revisão de scripts genéricos, além da preparação dos slides e da atualização do Caderno Aberto.</w:t>
             </w:r>
           </w:p>
         </w:tc>
@@ -2739,8 +2437,28 @@
             <w:vAlign w:val="center"/>
           </w:tcPr>
           <w:p>
-            <w:r>
-              <w:t>Horas aproximadas: 5 horas (até ao momento) | Revisão dos resultados preliminares, apoio à validação da estrutura da apresentação e preparação da reunião com o orientador.</w:t>
+            <w:pPr>
+              <w:rPr>
+                <w:lang w:val="pt-PT"/>
+              </w:rPr>
+            </w:pPr>
+            <w:r>
+              <w:rPr>
+                <w:lang w:val="pt-PT"/>
+              </w:rPr>
+              <w:t xml:space="preserve">Horas aproximadas: </w:t>
+            </w:r>
+            <w:r>
+              <w:rPr>
+                <w:lang w:val="pt-PT"/>
+              </w:rPr>
+              <w:t>7</w:t>
+            </w:r>
+            <w:r>
+              <w:rPr>
+                <w:lang w:val="pt-PT"/>
+              </w:rPr>
+              <w:t xml:space="preserve"> horas (até ao momento) | Revisão dos resultados preliminares, apoio à validação da estrutura da apresentação e preparação da reunião com o orientador.</w:t>
             </w:r>
           </w:p>
         </w:tc>
@@ -2787,8 +2505,28 @@
             <w:vAlign w:val="center"/>
           </w:tcPr>
           <w:p>
-            <w:r>
-              <w:t>Horas aproximadas: 10 horas (até ao momento) | Continuação da implementação, atualização do repositório com versões mais genéricas dos scripts e organização do código antes da reunião.</w:t>
+            <w:pPr>
+              <w:rPr>
+                <w:lang w:val="pt-PT"/>
+              </w:rPr>
+            </w:pPr>
+            <w:r>
+              <w:rPr>
+                <w:lang w:val="pt-PT"/>
+              </w:rPr>
+              <w:t xml:space="preserve">Horas aproximadas: </w:t>
+            </w:r>
+            <w:r>
+              <w:rPr>
+                <w:lang w:val="pt-PT"/>
+              </w:rPr>
+              <w:t>8</w:t>
+            </w:r>
+            <w:r>
+              <w:rPr>
+                <w:lang w:val="pt-PT"/>
+              </w:rPr>
+              <w:t xml:space="preserve"> horas (até ao momento) | Continuação da implementação, atualização do repositório com versões mais genéricas dos scripts e organização do código antes da reunião.</w:t>
             </w:r>
           </w:p>
         </w:tc>
@@ -2813,31 +2551,14 @@
             <w:pPr>
               <w:spacing w:after="0"/>
             </w:pPr>
-            <w:proofErr w:type="spellStart"/>
             <w:r>
               <w:rPr>
                 <w:b/>
                 <w:color w:val="1F4E79"/>
               </w:rPr>
-              <w:t>Sintese</w:t>
-            </w:r>
-            <w:proofErr w:type="spellEnd"/>
-            <w:r>
-              <w:rPr>
-                <w:b/>
-                <w:color w:val="1F4E79"/>
-              </w:rPr>
-              <w:t xml:space="preserve"> do </w:t>
-            </w:r>
-            <w:proofErr w:type="spellStart"/>
-            <w:r>
-              <w:rPr>
-                <w:b/>
-                <w:color w:val="1F4E79"/>
-              </w:rPr>
-              <w:t>grupo</w:t>
-            </w:r>
-            <w:proofErr w:type="spellEnd"/>
+              <w:lastRenderedPageBreak/>
+              <w:t>Sintese do grupo</w:t>
+            </w:r>
           </w:p>
         </w:tc>
         <w:tc>
@@ -2853,7 +2574,15 @@
             <w:vAlign w:val="center"/>
           </w:tcPr>
           <w:p>
-            <w:r>
+            <w:pPr>
+              <w:rPr>
+                <w:lang w:val="pt-PT"/>
+              </w:rPr>
+            </w:pPr>
+            <w:r>
+              <w:rPr>
+                <w:lang w:val="pt-PT"/>
+              </w:rPr>
               <w:t>Esta semana foi dedicada à consolidação do repositório, à atualização da documentação e à preparação da reunião de acompanhamento. O projeto passou a evidenciar melhor a transição entre a fase exploratória e uma fase mais genérica e reutilizável.</w:t>
             </w:r>
           </w:p>
@@ -2879,31 +2608,20 @@
             <w:pPr>
               <w:spacing w:after="0"/>
             </w:pPr>
-            <w:proofErr w:type="spellStart"/>
             <w:r>
               <w:rPr>
                 <w:b/>
                 <w:color w:val="1F4E79"/>
               </w:rPr>
-              <w:t>Próxima</w:t>
-            </w:r>
-            <w:proofErr w:type="spellEnd"/>
+              <w:t xml:space="preserve">Próxima </w:t>
+            </w:r>
             <w:r>
               <w:rPr>
                 <w:b/>
                 <w:color w:val="1F4E79"/>
               </w:rPr>
-              <w:t xml:space="preserve"> </w:t>
-            </w:r>
-            <w:proofErr w:type="spellStart"/>
-            <w:r>
-              <w:rPr>
-                <w:b/>
-                <w:color w:val="1F4E79"/>
-              </w:rPr>
               <w:t>semana</w:t>
             </w:r>
-            <w:proofErr w:type="spellEnd"/>
           </w:p>
         </w:tc>
         <w:tc>
@@ -2919,7 +2637,15 @@
             <w:vAlign w:val="center"/>
           </w:tcPr>
           <w:p>
-            <w:r>
+            <w:pPr>
+              <w:rPr>
+                <w:lang w:val="pt-PT"/>
+              </w:rPr>
+            </w:pPr>
+            <w:r>
+              <w:rPr>
+                <w:lang w:val="pt-PT"/>
+              </w:rPr>
               <w:t>Recolher o feedback do orientador e decidir os próximos passos de modularização e reorganização do projeto.</w:t>
             </w:r>
           </w:p>
@@ -2929,6 +2655,9 @@
     <w:p>
       <w:pPr>
         <w:spacing w:after="10"/>
+        <w:rPr>
+          <w:lang w:val="pt-PT"/>
+        </w:rPr>
       </w:pPr>
     </w:p>
     <w:p>
@@ -2991,31 +2720,13 @@
             <w:pPr>
               <w:spacing w:after="0"/>
             </w:pPr>
-            <w:proofErr w:type="spellStart"/>
             <w:r>
               <w:rPr>
                 <w:b/>
                 <w:color w:val="1F4E79"/>
               </w:rPr>
-              <w:t>Objetivo</w:t>
-            </w:r>
-            <w:proofErr w:type="spellEnd"/>
-            <w:r>
-              <w:rPr>
-                <w:b/>
-                <w:color w:val="1F4E79"/>
-              </w:rPr>
-              <w:t xml:space="preserve">(s) da </w:t>
-            </w:r>
-            <w:proofErr w:type="spellStart"/>
-            <w:r>
-              <w:rPr>
-                <w:b/>
-                <w:color w:val="1F4E79"/>
-              </w:rPr>
-              <w:t>semana</w:t>
-            </w:r>
-            <w:proofErr w:type="spellEnd"/>
+              <w:t>Objetivo(s) da semana</w:t>
+            </w:r>
           </w:p>
         </w:tc>
         <w:tc>
@@ -3039,23 +2750,7 @@
                 <w:i/>
                 <w:color w:val="6E6E6E"/>
               </w:rPr>
-              <w:t>[</w:t>
-            </w:r>
-            <w:proofErr w:type="spellStart"/>
-            <w:r>
-              <w:rPr>
-                <w:i/>
-                <w:color w:val="6E6E6E"/>
-              </w:rPr>
-              <w:t>Preencher</w:t>
-            </w:r>
-            <w:proofErr w:type="spellEnd"/>
-            <w:r>
-              <w:rPr>
-                <w:i/>
-                <w:color w:val="6E6E6E"/>
-              </w:rPr>
-              <w:t>]</w:t>
+              <w:t>[Preencher]</w:t>
             </w:r>
           </w:p>
         </w:tc>
@@ -3109,44 +2804,14 @@
               <w:rPr>
                 <w:b/>
               </w:rPr>
-              <w:t xml:space="preserve">Horas </w:t>
-            </w:r>
-            <w:proofErr w:type="spellStart"/>
-            <w:r>
-              <w:rPr>
-                <w:b/>
-              </w:rPr>
-              <w:t>aproximadas</w:t>
-            </w:r>
-            <w:proofErr w:type="spellEnd"/>
-            <w:r>
-              <w:rPr>
-                <w:b/>
-              </w:rPr>
-              <w:t>: [ ] horas</w:t>
+              <w:t>Horas aproximadas: [ ] horas</w:t>
             </w:r>
             <w:r>
               <w:rPr>
                 <w:i/>
                 <w:color w:val="6E6E6E"/>
               </w:rPr>
-              <w:t xml:space="preserve"> | [</w:t>
-            </w:r>
-            <w:proofErr w:type="spellStart"/>
-            <w:r>
-              <w:rPr>
-                <w:i/>
-                <w:color w:val="6E6E6E"/>
-              </w:rPr>
-              <w:t>Preencher</w:t>
-            </w:r>
-            <w:proofErr w:type="spellEnd"/>
-            <w:r>
-              <w:rPr>
-                <w:i/>
-                <w:color w:val="6E6E6E"/>
-              </w:rPr>
-              <w:t>]</w:t>
+              <w:t xml:space="preserve"> | [Preencher]</w:t>
             </w:r>
           </w:p>
         </w:tc>
@@ -3207,44 +2872,14 @@
               <w:rPr>
                 <w:b/>
               </w:rPr>
-              <w:t xml:space="preserve">Horas </w:t>
-            </w:r>
-            <w:proofErr w:type="spellStart"/>
-            <w:r>
-              <w:rPr>
-                <w:b/>
-              </w:rPr>
-              <w:t>aproximadas</w:t>
-            </w:r>
-            <w:proofErr w:type="spellEnd"/>
-            <w:r>
-              <w:rPr>
-                <w:b/>
-              </w:rPr>
-              <w:t>: [ ] horas</w:t>
+              <w:t>Horas aproximadas: [ ] horas</w:t>
             </w:r>
             <w:r>
               <w:rPr>
                 <w:i/>
                 <w:color w:val="6E6E6E"/>
               </w:rPr>
-              <w:t xml:space="preserve"> | [</w:t>
-            </w:r>
-            <w:proofErr w:type="spellStart"/>
-            <w:r>
-              <w:rPr>
-                <w:i/>
-                <w:color w:val="6E6E6E"/>
-              </w:rPr>
-              <w:t>Preencher</w:t>
-            </w:r>
-            <w:proofErr w:type="spellEnd"/>
-            <w:r>
-              <w:rPr>
-                <w:i/>
-                <w:color w:val="6E6E6E"/>
-              </w:rPr>
-              <w:t>]</w:t>
+              <w:t xml:space="preserve"> | [Preencher]</w:t>
             </w:r>
           </w:p>
         </w:tc>
@@ -3298,44 +2933,14 @@
               <w:rPr>
                 <w:b/>
               </w:rPr>
-              <w:t xml:space="preserve">Horas </w:t>
-            </w:r>
-            <w:proofErr w:type="spellStart"/>
-            <w:r>
-              <w:rPr>
-                <w:b/>
-              </w:rPr>
-              <w:t>aproximadas</w:t>
-            </w:r>
-            <w:proofErr w:type="spellEnd"/>
-            <w:r>
-              <w:rPr>
-                <w:b/>
-              </w:rPr>
-              <w:t>: [ ] horas</w:t>
+              <w:t>Horas aproximadas: [ ] horas</w:t>
             </w:r>
             <w:r>
               <w:rPr>
                 <w:i/>
                 <w:color w:val="6E6E6E"/>
               </w:rPr>
-              <w:t xml:space="preserve"> | [</w:t>
-            </w:r>
-            <w:proofErr w:type="spellStart"/>
-            <w:r>
-              <w:rPr>
-                <w:i/>
-                <w:color w:val="6E6E6E"/>
-              </w:rPr>
-              <w:t>Preencher</w:t>
-            </w:r>
-            <w:proofErr w:type="spellEnd"/>
-            <w:r>
-              <w:rPr>
-                <w:i/>
-                <w:color w:val="6E6E6E"/>
-              </w:rPr>
-              <w:t>]</w:t>
+              <w:t xml:space="preserve"> | [Preencher]</w:t>
             </w:r>
           </w:p>
         </w:tc>
@@ -3360,31 +2965,13 @@
             <w:pPr>
               <w:spacing w:after="0"/>
             </w:pPr>
-            <w:proofErr w:type="spellStart"/>
             <w:r>
               <w:rPr>
                 <w:b/>
                 <w:color w:val="1F4E79"/>
               </w:rPr>
-              <w:t>Sintese</w:t>
-            </w:r>
-            <w:proofErr w:type="spellEnd"/>
-            <w:r>
-              <w:rPr>
-                <w:b/>
-                <w:color w:val="1F4E79"/>
-              </w:rPr>
-              <w:t xml:space="preserve"> do </w:t>
-            </w:r>
-            <w:proofErr w:type="spellStart"/>
-            <w:r>
-              <w:rPr>
-                <w:b/>
-                <w:color w:val="1F4E79"/>
-              </w:rPr>
-              <w:t>grupo</w:t>
-            </w:r>
-            <w:proofErr w:type="spellEnd"/>
+              <w:t>Sintese do grupo</w:t>
+            </w:r>
           </w:p>
         </w:tc>
         <w:tc>
@@ -3408,23 +2995,7 @@
                 <w:i/>
                 <w:color w:val="6E6E6E"/>
               </w:rPr>
-              <w:t>[</w:t>
-            </w:r>
-            <w:proofErr w:type="spellStart"/>
-            <w:r>
-              <w:rPr>
-                <w:i/>
-                <w:color w:val="6E6E6E"/>
-              </w:rPr>
-              <w:t>Preencher</w:t>
-            </w:r>
-            <w:proofErr w:type="spellEnd"/>
-            <w:r>
-              <w:rPr>
-                <w:i/>
-                <w:color w:val="6E6E6E"/>
-              </w:rPr>
-              <w:t>]</w:t>
+              <w:t>[Preencher]</w:t>
             </w:r>
           </w:p>
         </w:tc>
@@ -3449,31 +3020,20 @@
             <w:pPr>
               <w:spacing w:after="0"/>
             </w:pPr>
-            <w:proofErr w:type="spellStart"/>
             <w:r>
               <w:rPr>
                 <w:b/>
                 <w:color w:val="1F4E79"/>
               </w:rPr>
-              <w:t>Próxima</w:t>
-            </w:r>
-            <w:proofErr w:type="spellEnd"/>
+              <w:t xml:space="preserve">Próxima </w:t>
+            </w:r>
             <w:r>
               <w:rPr>
                 <w:b/>
                 <w:color w:val="1F4E79"/>
               </w:rPr>
-              <w:t xml:space="preserve"> </w:t>
-            </w:r>
-            <w:proofErr w:type="spellStart"/>
-            <w:r>
-              <w:rPr>
-                <w:b/>
-                <w:color w:val="1F4E79"/>
-              </w:rPr>
               <w:t>semana</w:t>
             </w:r>
-            <w:proofErr w:type="spellEnd"/>
           </w:p>
         </w:tc>
         <w:tc>
@@ -3497,23 +3057,7 @@
                 <w:i/>
                 <w:color w:val="6E6E6E"/>
               </w:rPr>
-              <w:t>[</w:t>
-            </w:r>
-            <w:proofErr w:type="spellStart"/>
-            <w:r>
-              <w:rPr>
-                <w:i/>
-                <w:color w:val="6E6E6E"/>
-              </w:rPr>
-              <w:t>Preencher</w:t>
-            </w:r>
-            <w:proofErr w:type="spellEnd"/>
-            <w:r>
-              <w:rPr>
-                <w:i/>
-                <w:color w:val="6E6E6E"/>
-              </w:rPr>
-              <w:t>]</w:t>
+              <w:t>[Preencher]</w:t>
             </w:r>
           </w:p>
         </w:tc>
@@ -3584,31 +3128,13 @@
             <w:pPr>
               <w:spacing w:after="0"/>
             </w:pPr>
-            <w:proofErr w:type="spellStart"/>
             <w:r>
               <w:rPr>
                 <w:b/>
                 <w:color w:val="1F4E79"/>
               </w:rPr>
-              <w:t>Objetivo</w:t>
-            </w:r>
-            <w:proofErr w:type="spellEnd"/>
-            <w:r>
-              <w:rPr>
-                <w:b/>
-                <w:color w:val="1F4E79"/>
-              </w:rPr>
-              <w:t xml:space="preserve">(s) da </w:t>
-            </w:r>
-            <w:proofErr w:type="spellStart"/>
-            <w:r>
-              <w:rPr>
-                <w:b/>
-                <w:color w:val="1F4E79"/>
-              </w:rPr>
-              <w:t>semana</w:t>
-            </w:r>
-            <w:proofErr w:type="spellEnd"/>
+              <w:t>Objetivo(s) da semana</w:t>
+            </w:r>
           </w:p>
         </w:tc>
         <w:tc>
@@ -3632,23 +3158,7 @@
                 <w:i/>
                 <w:color w:val="6E6E6E"/>
               </w:rPr>
-              <w:t>[</w:t>
-            </w:r>
-            <w:proofErr w:type="spellStart"/>
-            <w:r>
-              <w:rPr>
-                <w:i/>
-                <w:color w:val="6E6E6E"/>
-              </w:rPr>
-              <w:t>Preencher</w:t>
-            </w:r>
-            <w:proofErr w:type="spellEnd"/>
-            <w:r>
-              <w:rPr>
-                <w:i/>
-                <w:color w:val="6E6E6E"/>
-              </w:rPr>
-              <w:t>]</w:t>
+              <w:t>[Preencher]</w:t>
             </w:r>
           </w:p>
         </w:tc>
@@ -3702,44 +3212,14 @@
               <w:rPr>
                 <w:b/>
               </w:rPr>
-              <w:t xml:space="preserve">Horas </w:t>
-            </w:r>
-            <w:proofErr w:type="spellStart"/>
-            <w:r>
-              <w:rPr>
-                <w:b/>
-              </w:rPr>
-              <w:t>aproximadas</w:t>
-            </w:r>
-            <w:proofErr w:type="spellEnd"/>
-            <w:r>
-              <w:rPr>
-                <w:b/>
-              </w:rPr>
-              <w:t>: [ ] horas</w:t>
+              <w:t>Horas aproximadas: [ ] horas</w:t>
             </w:r>
             <w:r>
               <w:rPr>
                 <w:i/>
                 <w:color w:val="6E6E6E"/>
               </w:rPr>
-              <w:t xml:space="preserve"> | [</w:t>
-            </w:r>
-            <w:proofErr w:type="spellStart"/>
-            <w:r>
-              <w:rPr>
-                <w:i/>
-                <w:color w:val="6E6E6E"/>
-              </w:rPr>
-              <w:t>Preencher</w:t>
-            </w:r>
-            <w:proofErr w:type="spellEnd"/>
-            <w:r>
-              <w:rPr>
-                <w:i/>
-                <w:color w:val="6E6E6E"/>
-              </w:rPr>
-              <w:t>]</w:t>
+              <w:t xml:space="preserve"> | [Preencher]</w:t>
             </w:r>
           </w:p>
         </w:tc>
@@ -3800,44 +3280,14 @@
               <w:rPr>
                 <w:b/>
               </w:rPr>
-              <w:t xml:space="preserve">Horas </w:t>
-            </w:r>
-            <w:proofErr w:type="spellStart"/>
-            <w:r>
-              <w:rPr>
-                <w:b/>
-              </w:rPr>
-              <w:t>aproximadas</w:t>
-            </w:r>
-            <w:proofErr w:type="spellEnd"/>
-            <w:r>
-              <w:rPr>
-                <w:b/>
-              </w:rPr>
-              <w:t>: [ ] horas</w:t>
+              <w:t>Horas aproximadas: [ ] horas</w:t>
             </w:r>
             <w:r>
               <w:rPr>
                 <w:i/>
                 <w:color w:val="6E6E6E"/>
               </w:rPr>
-              <w:t xml:space="preserve"> | [</w:t>
-            </w:r>
-            <w:proofErr w:type="spellStart"/>
-            <w:r>
-              <w:rPr>
-                <w:i/>
-                <w:color w:val="6E6E6E"/>
-              </w:rPr>
-              <w:t>Preencher</w:t>
-            </w:r>
-            <w:proofErr w:type="spellEnd"/>
-            <w:r>
-              <w:rPr>
-                <w:i/>
-                <w:color w:val="6E6E6E"/>
-              </w:rPr>
-              <w:t>]</w:t>
+              <w:t xml:space="preserve"> | [Preencher]</w:t>
             </w:r>
           </w:p>
         </w:tc>
@@ -3891,44 +3341,14 @@
               <w:rPr>
                 <w:b/>
               </w:rPr>
-              <w:t xml:space="preserve">Horas </w:t>
-            </w:r>
-            <w:proofErr w:type="spellStart"/>
-            <w:r>
-              <w:rPr>
-                <w:b/>
-              </w:rPr>
-              <w:t>aproximadas</w:t>
-            </w:r>
-            <w:proofErr w:type="spellEnd"/>
-            <w:r>
-              <w:rPr>
-                <w:b/>
-              </w:rPr>
-              <w:t>: [ ] horas</w:t>
+              <w:t>Horas aproximadas: [ ] horas</w:t>
             </w:r>
             <w:r>
               <w:rPr>
                 <w:i/>
                 <w:color w:val="6E6E6E"/>
               </w:rPr>
-              <w:t xml:space="preserve"> | [</w:t>
-            </w:r>
-            <w:proofErr w:type="spellStart"/>
-            <w:r>
-              <w:rPr>
-                <w:i/>
-                <w:color w:val="6E6E6E"/>
-              </w:rPr>
-              <w:t>Preencher</w:t>
-            </w:r>
-            <w:proofErr w:type="spellEnd"/>
-            <w:r>
-              <w:rPr>
-                <w:i/>
-                <w:color w:val="6E6E6E"/>
-              </w:rPr>
-              <w:t>]</w:t>
+              <w:t xml:space="preserve"> | [Preencher]</w:t>
             </w:r>
           </w:p>
         </w:tc>
@@ -3953,31 +3373,13 @@
             <w:pPr>
               <w:spacing w:after="0"/>
             </w:pPr>
-            <w:proofErr w:type="spellStart"/>
             <w:r>
               <w:rPr>
                 <w:b/>
                 <w:color w:val="1F4E79"/>
               </w:rPr>
-              <w:t>Sintese</w:t>
-            </w:r>
-            <w:proofErr w:type="spellEnd"/>
-            <w:r>
-              <w:rPr>
-                <w:b/>
-                <w:color w:val="1F4E79"/>
-              </w:rPr>
-              <w:t xml:space="preserve"> do </w:t>
-            </w:r>
-            <w:proofErr w:type="spellStart"/>
-            <w:r>
-              <w:rPr>
-                <w:b/>
-                <w:color w:val="1F4E79"/>
-              </w:rPr>
-              <w:t>grupo</w:t>
-            </w:r>
-            <w:proofErr w:type="spellEnd"/>
+              <w:t>Sintese do grupo</w:t>
+            </w:r>
           </w:p>
         </w:tc>
         <w:tc>
@@ -4001,23 +3403,7 @@
                 <w:i/>
                 <w:color w:val="6E6E6E"/>
               </w:rPr>
-              <w:t>[</w:t>
-            </w:r>
-            <w:proofErr w:type="spellStart"/>
-            <w:r>
-              <w:rPr>
-                <w:i/>
-                <w:color w:val="6E6E6E"/>
-              </w:rPr>
-              <w:t>Preencher</w:t>
-            </w:r>
-            <w:proofErr w:type="spellEnd"/>
-            <w:r>
-              <w:rPr>
-                <w:i/>
-                <w:color w:val="6E6E6E"/>
-              </w:rPr>
-              <w:t>]</w:t>
+              <w:t>[Preencher]</w:t>
             </w:r>
           </w:p>
         </w:tc>
@@ -4042,31 +3428,20 @@
             <w:pPr>
               <w:spacing w:after="0"/>
             </w:pPr>
-            <w:proofErr w:type="spellStart"/>
             <w:r>
               <w:rPr>
                 <w:b/>
                 <w:color w:val="1F4E79"/>
               </w:rPr>
-              <w:t>Próxima</w:t>
-            </w:r>
-            <w:proofErr w:type="spellEnd"/>
+              <w:t xml:space="preserve">Próxima </w:t>
+            </w:r>
             <w:r>
               <w:rPr>
                 <w:b/>
                 <w:color w:val="1F4E79"/>
               </w:rPr>
-              <w:t xml:space="preserve"> </w:t>
-            </w:r>
-            <w:proofErr w:type="spellStart"/>
-            <w:r>
-              <w:rPr>
-                <w:b/>
-                <w:color w:val="1F4E79"/>
-              </w:rPr>
               <w:t>semana</w:t>
             </w:r>
-            <w:proofErr w:type="spellEnd"/>
           </w:p>
         </w:tc>
         <w:tc>
@@ -4090,38 +3465,13 @@
                 <w:i/>
                 <w:color w:val="6E6E6E"/>
               </w:rPr>
-              <w:t>[</w:t>
-            </w:r>
-            <w:proofErr w:type="spellStart"/>
-            <w:r>
-              <w:rPr>
-                <w:i/>
-                <w:color w:val="6E6E6E"/>
-              </w:rPr>
-              <w:t>Preencher</w:t>
-            </w:r>
-            <w:proofErr w:type="spellEnd"/>
-            <w:r>
-              <w:rPr>
-                <w:i/>
-                <w:color w:val="6E6E6E"/>
-              </w:rPr>
-              <w:t>]</w:t>
+              <w:t>[Preencher]</w:t>
             </w:r>
           </w:p>
         </w:tc>
       </w:tr>
     </w:tbl>
-    <w:p>
-      <w:pPr>
-        <w:spacing w:after="10"/>
-      </w:pPr>
-    </w:p>
-    <w:p>
-      <w:r>
-        <w:br w:type="page"/>
-      </w:r>
-    </w:p>
+    <w:p/>
     <w:p>
       <w:pPr>
         <w:spacing w:after="40"/>
@@ -4132,7 +3482,6 @@
           <w:color w:val="1F4E79"/>
           <w:sz w:val="21"/>
         </w:rPr>
-        <w:lastRenderedPageBreak/>
         <w:t xml:space="preserve">Semana </w:t>
       </w:r>
       <w:r>
@@ -4191,31 +3540,13 @@
             <w:pPr>
               <w:spacing w:after="0"/>
             </w:pPr>
-            <w:proofErr w:type="spellStart"/>
             <w:r>
               <w:rPr>
                 <w:b/>
                 <w:color w:val="1F4E79"/>
               </w:rPr>
-              <w:t>Objetivo</w:t>
-            </w:r>
-            <w:proofErr w:type="spellEnd"/>
-            <w:r>
-              <w:rPr>
-                <w:b/>
-                <w:color w:val="1F4E79"/>
-              </w:rPr>
-              <w:t xml:space="preserve">(s) da </w:t>
-            </w:r>
-            <w:proofErr w:type="spellStart"/>
-            <w:r>
-              <w:rPr>
-                <w:b/>
-                <w:color w:val="1F4E79"/>
-              </w:rPr>
-              <w:t>semana</w:t>
-            </w:r>
-            <w:proofErr w:type="spellEnd"/>
+              <w:t>Objetivo(s) da semana</w:t>
+            </w:r>
           </w:p>
         </w:tc>
         <w:tc>
@@ -4239,23 +3570,7 @@
                 <w:i/>
                 <w:color w:val="6E6E6E"/>
               </w:rPr>
-              <w:t>[</w:t>
-            </w:r>
-            <w:proofErr w:type="spellStart"/>
-            <w:r>
-              <w:rPr>
-                <w:i/>
-                <w:color w:val="6E6E6E"/>
-              </w:rPr>
-              <w:t>Preencher</w:t>
-            </w:r>
-            <w:proofErr w:type="spellEnd"/>
-            <w:r>
-              <w:rPr>
-                <w:i/>
-                <w:color w:val="6E6E6E"/>
-              </w:rPr>
-              <w:t>]</w:t>
+              <w:t>[Preencher]</w:t>
             </w:r>
           </w:p>
         </w:tc>
@@ -4309,44 +3624,14 @@
               <w:rPr>
                 <w:b/>
               </w:rPr>
-              <w:t xml:space="preserve">Horas </w:t>
-            </w:r>
-            <w:proofErr w:type="spellStart"/>
-            <w:r>
-              <w:rPr>
-                <w:b/>
-              </w:rPr>
-              <w:t>aproximadas</w:t>
-            </w:r>
-            <w:proofErr w:type="spellEnd"/>
-            <w:r>
-              <w:rPr>
-                <w:b/>
-              </w:rPr>
-              <w:t>: [ ] horas</w:t>
+              <w:t>Horas aproximadas: [ ] horas</w:t>
             </w:r>
             <w:r>
               <w:rPr>
                 <w:i/>
                 <w:color w:val="6E6E6E"/>
               </w:rPr>
-              <w:t xml:space="preserve"> | [</w:t>
-            </w:r>
-            <w:proofErr w:type="spellStart"/>
-            <w:r>
-              <w:rPr>
-                <w:i/>
-                <w:color w:val="6E6E6E"/>
-              </w:rPr>
-              <w:t>Preencher</w:t>
-            </w:r>
-            <w:proofErr w:type="spellEnd"/>
-            <w:r>
-              <w:rPr>
-                <w:i/>
-                <w:color w:val="6E6E6E"/>
-              </w:rPr>
-              <w:t>]</w:t>
+              <w:t xml:space="preserve"> | [Preencher]</w:t>
             </w:r>
           </w:p>
         </w:tc>
@@ -4407,44 +3692,14 @@
               <w:rPr>
                 <w:b/>
               </w:rPr>
-              <w:t xml:space="preserve">Horas </w:t>
-            </w:r>
-            <w:proofErr w:type="spellStart"/>
-            <w:r>
-              <w:rPr>
-                <w:b/>
-              </w:rPr>
-              <w:t>aproximadas</w:t>
-            </w:r>
-            <w:proofErr w:type="spellEnd"/>
-            <w:r>
-              <w:rPr>
-                <w:b/>
-              </w:rPr>
-              <w:t>: [ ] horas</w:t>
+              <w:t>Horas aproximadas: [ ] horas</w:t>
             </w:r>
             <w:r>
               <w:rPr>
                 <w:i/>
                 <w:color w:val="6E6E6E"/>
               </w:rPr>
-              <w:t xml:space="preserve"> | [</w:t>
-            </w:r>
-            <w:proofErr w:type="spellStart"/>
-            <w:r>
-              <w:rPr>
-                <w:i/>
-                <w:color w:val="6E6E6E"/>
-              </w:rPr>
-              <w:t>Preencher</w:t>
-            </w:r>
-            <w:proofErr w:type="spellEnd"/>
-            <w:r>
-              <w:rPr>
-                <w:i/>
-                <w:color w:val="6E6E6E"/>
-              </w:rPr>
-              <w:t>]</w:t>
+              <w:t xml:space="preserve"> | [Preencher]</w:t>
             </w:r>
           </w:p>
         </w:tc>
@@ -4498,44 +3753,14 @@
               <w:rPr>
                 <w:b/>
               </w:rPr>
-              <w:t xml:space="preserve">Horas </w:t>
-            </w:r>
-            <w:proofErr w:type="spellStart"/>
-            <w:r>
-              <w:rPr>
-                <w:b/>
-              </w:rPr>
-              <w:t>aproximadas</w:t>
-            </w:r>
-            <w:proofErr w:type="spellEnd"/>
-            <w:r>
-              <w:rPr>
-                <w:b/>
-              </w:rPr>
-              <w:t>: [ ] horas</w:t>
+              <w:t>Horas aproximadas: [ ] horas</w:t>
             </w:r>
             <w:r>
               <w:rPr>
                 <w:i/>
                 <w:color w:val="6E6E6E"/>
               </w:rPr>
-              <w:t xml:space="preserve"> | [</w:t>
-            </w:r>
-            <w:proofErr w:type="spellStart"/>
-            <w:r>
-              <w:rPr>
-                <w:i/>
-                <w:color w:val="6E6E6E"/>
-              </w:rPr>
-              <w:t>Preencher</w:t>
-            </w:r>
-            <w:proofErr w:type="spellEnd"/>
-            <w:r>
-              <w:rPr>
-                <w:i/>
-                <w:color w:val="6E6E6E"/>
-              </w:rPr>
-              <w:t>]</w:t>
+              <w:t xml:space="preserve"> | [Preencher]</w:t>
             </w:r>
           </w:p>
         </w:tc>
@@ -4560,31 +3785,13 @@
             <w:pPr>
               <w:spacing w:after="0"/>
             </w:pPr>
-            <w:proofErr w:type="spellStart"/>
             <w:r>
               <w:rPr>
                 <w:b/>
                 <w:color w:val="1F4E79"/>
               </w:rPr>
-              <w:t>Sintese</w:t>
-            </w:r>
-            <w:proofErr w:type="spellEnd"/>
-            <w:r>
-              <w:rPr>
-                <w:b/>
-                <w:color w:val="1F4E79"/>
-              </w:rPr>
-              <w:t xml:space="preserve"> do </w:t>
-            </w:r>
-            <w:proofErr w:type="spellStart"/>
-            <w:r>
-              <w:rPr>
-                <w:b/>
-                <w:color w:val="1F4E79"/>
-              </w:rPr>
-              <w:t>grupo</w:t>
-            </w:r>
-            <w:proofErr w:type="spellEnd"/>
+              <w:t>Sintese do grupo</w:t>
+            </w:r>
           </w:p>
         </w:tc>
         <w:tc>
@@ -4608,23 +3815,7 @@
                 <w:i/>
                 <w:color w:val="6E6E6E"/>
               </w:rPr>
-              <w:t>[</w:t>
-            </w:r>
-            <w:proofErr w:type="spellStart"/>
-            <w:r>
-              <w:rPr>
-                <w:i/>
-                <w:color w:val="6E6E6E"/>
-              </w:rPr>
-              <w:t>Preencher</w:t>
-            </w:r>
-            <w:proofErr w:type="spellEnd"/>
-            <w:r>
-              <w:rPr>
-                <w:i/>
-                <w:color w:val="6E6E6E"/>
-              </w:rPr>
-              <w:t>]</w:t>
+              <w:t>[Preencher]</w:t>
             </w:r>
           </w:p>
         </w:tc>
@@ -4649,31 +3840,20 @@
             <w:pPr>
               <w:spacing w:after="0"/>
             </w:pPr>
-            <w:proofErr w:type="spellStart"/>
             <w:r>
               <w:rPr>
                 <w:b/>
                 <w:color w:val="1F4E79"/>
               </w:rPr>
-              <w:t>Próxima</w:t>
-            </w:r>
-            <w:proofErr w:type="spellEnd"/>
+              <w:t xml:space="preserve">Próxima </w:t>
+            </w:r>
             <w:r>
               <w:rPr>
                 <w:b/>
                 <w:color w:val="1F4E79"/>
               </w:rPr>
-              <w:t xml:space="preserve"> </w:t>
-            </w:r>
-            <w:proofErr w:type="spellStart"/>
-            <w:r>
-              <w:rPr>
-                <w:b/>
-                <w:color w:val="1F4E79"/>
-              </w:rPr>
               <w:t>semana</w:t>
             </w:r>
-            <w:proofErr w:type="spellEnd"/>
           </w:p>
         </w:tc>
         <w:tc>
@@ -4697,23 +3877,7 @@
                 <w:i/>
                 <w:color w:val="6E6E6E"/>
               </w:rPr>
-              <w:t>[</w:t>
-            </w:r>
-            <w:proofErr w:type="spellStart"/>
-            <w:r>
-              <w:rPr>
-                <w:i/>
-                <w:color w:val="6E6E6E"/>
-              </w:rPr>
-              <w:t>Preencher</w:t>
-            </w:r>
-            <w:proofErr w:type="spellEnd"/>
-            <w:r>
-              <w:rPr>
-                <w:i/>
-                <w:color w:val="6E6E6E"/>
-              </w:rPr>
-              <w:t>]</w:t>
+              <w:t>[Preencher]</w:t>
             </w:r>
           </w:p>
         </w:tc>
@@ -4792,31 +3956,13 @@
             <w:pPr>
               <w:spacing w:after="0"/>
             </w:pPr>
-            <w:proofErr w:type="spellStart"/>
             <w:r>
               <w:rPr>
                 <w:b/>
                 <w:color w:val="1F4E79"/>
               </w:rPr>
-              <w:t>Objetivo</w:t>
-            </w:r>
-            <w:proofErr w:type="spellEnd"/>
-            <w:r>
-              <w:rPr>
-                <w:b/>
-                <w:color w:val="1F4E79"/>
-              </w:rPr>
-              <w:t xml:space="preserve">(s) da </w:t>
-            </w:r>
-            <w:proofErr w:type="spellStart"/>
-            <w:r>
-              <w:rPr>
-                <w:b/>
-                <w:color w:val="1F4E79"/>
-              </w:rPr>
-              <w:t>semana</w:t>
-            </w:r>
-            <w:proofErr w:type="spellEnd"/>
+              <w:t>Objetivo(s) da semana</w:t>
+            </w:r>
           </w:p>
         </w:tc>
         <w:tc>
@@ -4840,23 +3986,7 @@
                 <w:i/>
                 <w:color w:val="6E6E6E"/>
               </w:rPr>
-              <w:t>[</w:t>
-            </w:r>
-            <w:proofErr w:type="spellStart"/>
-            <w:r>
-              <w:rPr>
-                <w:i/>
-                <w:color w:val="6E6E6E"/>
-              </w:rPr>
-              <w:t>Preencher</w:t>
-            </w:r>
-            <w:proofErr w:type="spellEnd"/>
-            <w:r>
-              <w:rPr>
-                <w:i/>
-                <w:color w:val="6E6E6E"/>
-              </w:rPr>
-              <w:t>]</w:t>
+              <w:t>[Preencher]</w:t>
             </w:r>
           </w:p>
         </w:tc>
@@ -4910,44 +4040,14 @@
               <w:rPr>
                 <w:b/>
               </w:rPr>
-              <w:t xml:space="preserve">Horas </w:t>
-            </w:r>
-            <w:proofErr w:type="spellStart"/>
-            <w:r>
-              <w:rPr>
-                <w:b/>
-              </w:rPr>
-              <w:t>aproximadas</w:t>
-            </w:r>
-            <w:proofErr w:type="spellEnd"/>
-            <w:r>
-              <w:rPr>
-                <w:b/>
-              </w:rPr>
-              <w:t>: [ ] horas</w:t>
+              <w:t>Horas aproximadas: [ ] horas</w:t>
             </w:r>
             <w:r>
               <w:rPr>
                 <w:i/>
                 <w:color w:val="6E6E6E"/>
               </w:rPr>
-              <w:t xml:space="preserve"> | [</w:t>
-            </w:r>
-            <w:proofErr w:type="spellStart"/>
-            <w:r>
-              <w:rPr>
-                <w:i/>
-                <w:color w:val="6E6E6E"/>
-              </w:rPr>
-              <w:t>Preencher</w:t>
-            </w:r>
-            <w:proofErr w:type="spellEnd"/>
-            <w:r>
-              <w:rPr>
-                <w:i/>
-                <w:color w:val="6E6E6E"/>
-              </w:rPr>
-              <w:t>]</w:t>
+              <w:t xml:space="preserve"> | [Preencher]</w:t>
             </w:r>
           </w:p>
         </w:tc>
@@ -5008,44 +4108,14 @@
               <w:rPr>
                 <w:b/>
               </w:rPr>
-              <w:t xml:space="preserve">Horas </w:t>
-            </w:r>
-            <w:proofErr w:type="spellStart"/>
-            <w:r>
-              <w:rPr>
-                <w:b/>
-              </w:rPr>
-              <w:t>aproximadas</w:t>
-            </w:r>
-            <w:proofErr w:type="spellEnd"/>
-            <w:r>
-              <w:rPr>
-                <w:b/>
-              </w:rPr>
-              <w:t>: [ ] horas</w:t>
+              <w:t>Horas aproximadas: [ ] horas</w:t>
             </w:r>
             <w:r>
               <w:rPr>
                 <w:i/>
                 <w:color w:val="6E6E6E"/>
               </w:rPr>
-              <w:t xml:space="preserve"> | [</w:t>
-            </w:r>
-            <w:proofErr w:type="spellStart"/>
-            <w:r>
-              <w:rPr>
-                <w:i/>
-                <w:color w:val="6E6E6E"/>
-              </w:rPr>
-              <w:t>Preencher</w:t>
-            </w:r>
-            <w:proofErr w:type="spellEnd"/>
-            <w:r>
-              <w:rPr>
-                <w:i/>
-                <w:color w:val="6E6E6E"/>
-              </w:rPr>
-              <w:t>]</w:t>
+              <w:t xml:space="preserve"> | [Preencher]</w:t>
             </w:r>
           </w:p>
         </w:tc>
@@ -5099,44 +4169,14 @@
               <w:rPr>
                 <w:b/>
               </w:rPr>
-              <w:t xml:space="preserve">Horas </w:t>
-            </w:r>
-            <w:proofErr w:type="spellStart"/>
-            <w:r>
-              <w:rPr>
-                <w:b/>
-              </w:rPr>
-              <w:t>aproximadas</w:t>
-            </w:r>
-            <w:proofErr w:type="spellEnd"/>
-            <w:r>
-              <w:rPr>
-                <w:b/>
-              </w:rPr>
-              <w:t>: [ ] horas</w:t>
+              <w:t>Horas aproximadas: [ ] horas</w:t>
             </w:r>
             <w:r>
               <w:rPr>
                 <w:i/>
                 <w:color w:val="6E6E6E"/>
               </w:rPr>
-              <w:t xml:space="preserve"> | [</w:t>
-            </w:r>
-            <w:proofErr w:type="spellStart"/>
-            <w:r>
-              <w:rPr>
-                <w:i/>
-                <w:color w:val="6E6E6E"/>
-              </w:rPr>
-              <w:t>Preencher</w:t>
-            </w:r>
-            <w:proofErr w:type="spellEnd"/>
-            <w:r>
-              <w:rPr>
-                <w:i/>
-                <w:color w:val="6E6E6E"/>
-              </w:rPr>
-              <w:t>]</w:t>
+              <w:t xml:space="preserve"> | [Preencher]</w:t>
             </w:r>
           </w:p>
         </w:tc>
@@ -5161,31 +4201,13 @@
             <w:pPr>
               <w:spacing w:after="0"/>
             </w:pPr>
-            <w:proofErr w:type="spellStart"/>
             <w:r>
               <w:rPr>
                 <w:b/>
                 <w:color w:val="1F4E79"/>
               </w:rPr>
-              <w:t>Sintese</w:t>
-            </w:r>
-            <w:proofErr w:type="spellEnd"/>
-            <w:r>
-              <w:rPr>
-                <w:b/>
-                <w:color w:val="1F4E79"/>
-              </w:rPr>
-              <w:t xml:space="preserve"> do </w:t>
-            </w:r>
-            <w:proofErr w:type="spellStart"/>
-            <w:r>
-              <w:rPr>
-                <w:b/>
-                <w:color w:val="1F4E79"/>
-              </w:rPr>
-              <w:t>grupo</w:t>
-            </w:r>
-            <w:proofErr w:type="spellEnd"/>
+              <w:t>Sintese do grupo</w:t>
+            </w:r>
           </w:p>
         </w:tc>
         <w:tc>
@@ -5209,23 +4231,7 @@
                 <w:i/>
                 <w:color w:val="6E6E6E"/>
               </w:rPr>
-              <w:t>[</w:t>
-            </w:r>
-            <w:proofErr w:type="spellStart"/>
-            <w:r>
-              <w:rPr>
-                <w:i/>
-                <w:color w:val="6E6E6E"/>
-              </w:rPr>
-              <w:t>Preencher</w:t>
-            </w:r>
-            <w:proofErr w:type="spellEnd"/>
-            <w:r>
-              <w:rPr>
-                <w:i/>
-                <w:color w:val="6E6E6E"/>
-              </w:rPr>
-              <w:t>]</w:t>
+              <w:t>[Preencher]</w:t>
             </w:r>
           </w:p>
         </w:tc>
@@ -5250,31 +4256,20 @@
             <w:pPr>
               <w:spacing w:after="0"/>
             </w:pPr>
-            <w:proofErr w:type="spellStart"/>
             <w:r>
               <w:rPr>
                 <w:b/>
                 <w:color w:val="1F4E79"/>
               </w:rPr>
-              <w:t>Próxima</w:t>
-            </w:r>
-            <w:proofErr w:type="spellEnd"/>
+              <w:t xml:space="preserve">Próxima </w:t>
+            </w:r>
             <w:r>
               <w:rPr>
                 <w:b/>
                 <w:color w:val="1F4E79"/>
               </w:rPr>
-              <w:t xml:space="preserve"> </w:t>
-            </w:r>
-            <w:proofErr w:type="spellStart"/>
-            <w:r>
-              <w:rPr>
-                <w:b/>
-                <w:color w:val="1F4E79"/>
-              </w:rPr>
               <w:t>semana</w:t>
             </w:r>
-            <w:proofErr w:type="spellEnd"/>
           </w:p>
         </w:tc>
         <w:tc>
@@ -5298,23 +4293,7 @@
                 <w:i/>
                 <w:color w:val="6E6E6E"/>
               </w:rPr>
-              <w:t>[</w:t>
-            </w:r>
-            <w:proofErr w:type="spellStart"/>
-            <w:r>
-              <w:rPr>
-                <w:i/>
-                <w:color w:val="6E6E6E"/>
-              </w:rPr>
-              <w:t>Preencher</w:t>
-            </w:r>
-            <w:proofErr w:type="spellEnd"/>
-            <w:r>
-              <w:rPr>
-                <w:i/>
-                <w:color w:val="6E6E6E"/>
-              </w:rPr>
-              <w:t>]</w:t>
+              <w:t>[Preencher]</w:t>
             </w:r>
           </w:p>
         </w:tc>
@@ -5385,31 +4364,13 @@
             <w:pPr>
               <w:spacing w:after="0"/>
             </w:pPr>
-            <w:proofErr w:type="spellStart"/>
             <w:r>
               <w:rPr>
                 <w:b/>
                 <w:color w:val="1F4E79"/>
               </w:rPr>
-              <w:t>Objetivo</w:t>
-            </w:r>
-            <w:proofErr w:type="spellEnd"/>
-            <w:r>
-              <w:rPr>
-                <w:b/>
-                <w:color w:val="1F4E79"/>
-              </w:rPr>
-              <w:t xml:space="preserve">(s) da </w:t>
-            </w:r>
-            <w:proofErr w:type="spellStart"/>
-            <w:r>
-              <w:rPr>
-                <w:b/>
-                <w:color w:val="1F4E79"/>
-              </w:rPr>
-              <w:t>semana</w:t>
-            </w:r>
-            <w:proofErr w:type="spellEnd"/>
+              <w:t>Objetivo(s) da semana</w:t>
+            </w:r>
           </w:p>
         </w:tc>
         <w:tc>
@@ -5433,23 +4394,7 @@
                 <w:i/>
                 <w:color w:val="6E6E6E"/>
               </w:rPr>
-              <w:t>[</w:t>
-            </w:r>
-            <w:proofErr w:type="spellStart"/>
-            <w:r>
-              <w:rPr>
-                <w:i/>
-                <w:color w:val="6E6E6E"/>
-              </w:rPr>
-              <w:t>Preencher</w:t>
-            </w:r>
-            <w:proofErr w:type="spellEnd"/>
-            <w:r>
-              <w:rPr>
-                <w:i/>
-                <w:color w:val="6E6E6E"/>
-              </w:rPr>
-              <w:t>]</w:t>
+              <w:t>[Preencher]</w:t>
             </w:r>
           </w:p>
         </w:tc>
@@ -5503,44 +4448,14 @@
               <w:rPr>
                 <w:b/>
               </w:rPr>
-              <w:t xml:space="preserve">Horas </w:t>
-            </w:r>
-            <w:proofErr w:type="spellStart"/>
-            <w:r>
-              <w:rPr>
-                <w:b/>
-              </w:rPr>
-              <w:t>aproximadas</w:t>
-            </w:r>
-            <w:proofErr w:type="spellEnd"/>
-            <w:r>
-              <w:rPr>
-                <w:b/>
-              </w:rPr>
-              <w:t>: [ ] horas</w:t>
+              <w:t>Horas aproximadas: [ ] horas</w:t>
             </w:r>
             <w:r>
               <w:rPr>
                 <w:i/>
                 <w:color w:val="6E6E6E"/>
               </w:rPr>
-              <w:t xml:space="preserve"> | [</w:t>
-            </w:r>
-            <w:proofErr w:type="spellStart"/>
-            <w:r>
-              <w:rPr>
-                <w:i/>
-                <w:color w:val="6E6E6E"/>
-              </w:rPr>
-              <w:t>Preencher</w:t>
-            </w:r>
-            <w:proofErr w:type="spellEnd"/>
-            <w:r>
-              <w:rPr>
-                <w:i/>
-                <w:color w:val="6E6E6E"/>
-              </w:rPr>
-              <w:t>]</w:t>
+              <w:t xml:space="preserve"> | [Preencher]</w:t>
             </w:r>
           </w:p>
         </w:tc>
@@ -5601,44 +4516,14 @@
               <w:rPr>
                 <w:b/>
               </w:rPr>
-              <w:t xml:space="preserve">Horas </w:t>
-            </w:r>
-            <w:proofErr w:type="spellStart"/>
-            <w:r>
-              <w:rPr>
-                <w:b/>
-              </w:rPr>
-              <w:t>aproximadas</w:t>
-            </w:r>
-            <w:proofErr w:type="spellEnd"/>
-            <w:r>
-              <w:rPr>
-                <w:b/>
-              </w:rPr>
-              <w:t>: [ ] horas</w:t>
+              <w:t>Horas aproximadas: [ ] horas</w:t>
             </w:r>
             <w:r>
               <w:rPr>
                 <w:i/>
                 <w:color w:val="6E6E6E"/>
               </w:rPr>
-              <w:t xml:space="preserve"> | [</w:t>
-            </w:r>
-            <w:proofErr w:type="spellStart"/>
-            <w:r>
-              <w:rPr>
-                <w:i/>
-                <w:color w:val="6E6E6E"/>
-              </w:rPr>
-              <w:t>Preencher</w:t>
-            </w:r>
-            <w:proofErr w:type="spellEnd"/>
-            <w:r>
-              <w:rPr>
-                <w:i/>
-                <w:color w:val="6E6E6E"/>
-              </w:rPr>
-              <w:t>]</w:t>
+              <w:t xml:space="preserve"> | [Preencher]</w:t>
             </w:r>
           </w:p>
         </w:tc>
@@ -5692,44 +4577,14 @@
               <w:rPr>
                 <w:b/>
               </w:rPr>
-              <w:t xml:space="preserve">Horas </w:t>
-            </w:r>
-            <w:proofErr w:type="spellStart"/>
-            <w:r>
-              <w:rPr>
-                <w:b/>
-              </w:rPr>
-              <w:t>aproximadas</w:t>
-            </w:r>
-            <w:proofErr w:type="spellEnd"/>
-            <w:r>
-              <w:rPr>
-                <w:b/>
-              </w:rPr>
-              <w:t>: [ ] horas</w:t>
+              <w:t>Horas aproximadas: [ ] horas</w:t>
             </w:r>
             <w:r>
               <w:rPr>
                 <w:i/>
                 <w:color w:val="6E6E6E"/>
               </w:rPr>
-              <w:t xml:space="preserve"> | [</w:t>
-            </w:r>
-            <w:proofErr w:type="spellStart"/>
-            <w:r>
-              <w:rPr>
-                <w:i/>
-                <w:color w:val="6E6E6E"/>
-              </w:rPr>
-              <w:t>Preencher</w:t>
-            </w:r>
-            <w:proofErr w:type="spellEnd"/>
-            <w:r>
-              <w:rPr>
-                <w:i/>
-                <w:color w:val="6E6E6E"/>
-              </w:rPr>
-              <w:t>]</w:t>
+              <w:t xml:space="preserve"> | [Preencher]</w:t>
             </w:r>
           </w:p>
         </w:tc>
@@ -5754,31 +4609,13 @@
             <w:pPr>
               <w:spacing w:after="0"/>
             </w:pPr>
-            <w:proofErr w:type="spellStart"/>
             <w:r>
               <w:rPr>
                 <w:b/>
                 <w:color w:val="1F4E79"/>
               </w:rPr>
-              <w:t>Sintese</w:t>
-            </w:r>
-            <w:proofErr w:type="spellEnd"/>
-            <w:r>
-              <w:rPr>
-                <w:b/>
-                <w:color w:val="1F4E79"/>
-              </w:rPr>
-              <w:t xml:space="preserve"> do </w:t>
-            </w:r>
-            <w:proofErr w:type="spellStart"/>
-            <w:r>
-              <w:rPr>
-                <w:b/>
-                <w:color w:val="1F4E79"/>
-              </w:rPr>
-              <w:t>grupo</w:t>
-            </w:r>
-            <w:proofErr w:type="spellEnd"/>
+              <w:t>Sintese do grupo</w:t>
+            </w:r>
           </w:p>
         </w:tc>
         <w:tc>
@@ -5802,23 +4639,7 @@
                 <w:i/>
                 <w:color w:val="6E6E6E"/>
               </w:rPr>
-              <w:t>[</w:t>
-            </w:r>
-            <w:proofErr w:type="spellStart"/>
-            <w:r>
-              <w:rPr>
-                <w:i/>
-                <w:color w:val="6E6E6E"/>
-              </w:rPr>
-              <w:t>Preencher</w:t>
-            </w:r>
-            <w:proofErr w:type="spellEnd"/>
-            <w:r>
-              <w:rPr>
-                <w:i/>
-                <w:color w:val="6E6E6E"/>
-              </w:rPr>
-              <w:t>]</w:t>
+              <w:t>[Preencher]</w:t>
             </w:r>
           </w:p>
         </w:tc>
@@ -5843,31 +4664,20 @@
             <w:pPr>
               <w:spacing w:after="0"/>
             </w:pPr>
-            <w:proofErr w:type="spellStart"/>
             <w:r>
               <w:rPr>
                 <w:b/>
                 <w:color w:val="1F4E79"/>
               </w:rPr>
-              <w:t>Próxima</w:t>
-            </w:r>
-            <w:proofErr w:type="spellEnd"/>
+              <w:t xml:space="preserve">Próxima </w:t>
+            </w:r>
             <w:r>
               <w:rPr>
                 <w:b/>
                 <w:color w:val="1F4E79"/>
               </w:rPr>
-              <w:t xml:space="preserve"> </w:t>
-            </w:r>
-            <w:proofErr w:type="spellStart"/>
-            <w:r>
-              <w:rPr>
-                <w:b/>
-                <w:color w:val="1F4E79"/>
-              </w:rPr>
               <w:t>semana</w:t>
             </w:r>
-            <w:proofErr w:type="spellEnd"/>
           </w:p>
         </w:tc>
         <w:tc>
@@ -5891,23 +4701,7 @@
                 <w:i/>
                 <w:color w:val="6E6E6E"/>
               </w:rPr>
-              <w:t>[</w:t>
-            </w:r>
-            <w:proofErr w:type="spellStart"/>
-            <w:r>
-              <w:rPr>
-                <w:i/>
-                <w:color w:val="6E6E6E"/>
-              </w:rPr>
-              <w:t>Preencher</w:t>
-            </w:r>
-            <w:proofErr w:type="spellEnd"/>
-            <w:r>
-              <w:rPr>
-                <w:i/>
-                <w:color w:val="6E6E6E"/>
-              </w:rPr>
-              <w:t>]</w:t>
+              <w:t>[Preencher]</w:t>
             </w:r>
           </w:p>
         </w:tc>
@@ -5978,31 +4772,13 @@
             <w:pPr>
               <w:spacing w:after="0"/>
             </w:pPr>
-            <w:proofErr w:type="spellStart"/>
             <w:r>
               <w:rPr>
                 <w:b/>
                 <w:color w:val="1F4E79"/>
               </w:rPr>
-              <w:t>Objetivo</w:t>
-            </w:r>
-            <w:proofErr w:type="spellEnd"/>
-            <w:r>
-              <w:rPr>
-                <w:b/>
-                <w:color w:val="1F4E79"/>
-              </w:rPr>
-              <w:t xml:space="preserve">(s) da </w:t>
-            </w:r>
-            <w:proofErr w:type="spellStart"/>
-            <w:r>
-              <w:rPr>
-                <w:b/>
-                <w:color w:val="1F4E79"/>
-              </w:rPr>
-              <w:t>semana</w:t>
-            </w:r>
-            <w:proofErr w:type="spellEnd"/>
+              <w:t>Objetivo(s) da semana</w:t>
+            </w:r>
           </w:p>
         </w:tc>
         <w:tc>
@@ -6026,23 +4802,7 @@
                 <w:i/>
                 <w:color w:val="6E6E6E"/>
               </w:rPr>
-              <w:t>[</w:t>
-            </w:r>
-            <w:proofErr w:type="spellStart"/>
-            <w:r>
-              <w:rPr>
-                <w:i/>
-                <w:color w:val="6E6E6E"/>
-              </w:rPr>
-              <w:t>Preencher</w:t>
-            </w:r>
-            <w:proofErr w:type="spellEnd"/>
-            <w:r>
-              <w:rPr>
-                <w:i/>
-                <w:color w:val="6E6E6E"/>
-              </w:rPr>
-              <w:t>]</w:t>
+              <w:t>[Preencher]</w:t>
             </w:r>
           </w:p>
         </w:tc>
@@ -6096,44 +4856,14 @@
               <w:rPr>
                 <w:b/>
               </w:rPr>
-              <w:t xml:space="preserve">Horas </w:t>
-            </w:r>
-            <w:proofErr w:type="spellStart"/>
-            <w:r>
-              <w:rPr>
-                <w:b/>
-              </w:rPr>
-              <w:t>aproximadas</w:t>
-            </w:r>
-            <w:proofErr w:type="spellEnd"/>
-            <w:r>
-              <w:rPr>
-                <w:b/>
-              </w:rPr>
-              <w:t>: [ ] horas</w:t>
+              <w:t>Horas aproximadas: [ ] horas</w:t>
             </w:r>
             <w:r>
               <w:rPr>
                 <w:i/>
                 <w:color w:val="6E6E6E"/>
               </w:rPr>
-              <w:t xml:space="preserve"> | [</w:t>
-            </w:r>
-            <w:proofErr w:type="spellStart"/>
-            <w:r>
-              <w:rPr>
-                <w:i/>
-                <w:color w:val="6E6E6E"/>
-              </w:rPr>
-              <w:t>Preencher</w:t>
-            </w:r>
-            <w:proofErr w:type="spellEnd"/>
-            <w:r>
-              <w:rPr>
-                <w:i/>
-                <w:color w:val="6E6E6E"/>
-              </w:rPr>
-              <w:t>]</w:t>
+              <w:t xml:space="preserve"> | [Preencher]</w:t>
             </w:r>
           </w:p>
         </w:tc>
@@ -6194,44 +4924,14 @@
               <w:rPr>
                 <w:b/>
               </w:rPr>
-              <w:t xml:space="preserve">Horas </w:t>
-            </w:r>
-            <w:proofErr w:type="spellStart"/>
-            <w:r>
-              <w:rPr>
-                <w:b/>
-              </w:rPr>
-              <w:t>aproximadas</w:t>
-            </w:r>
-            <w:proofErr w:type="spellEnd"/>
-            <w:r>
-              <w:rPr>
-                <w:b/>
-              </w:rPr>
-              <w:t>: [ ] horas</w:t>
+              <w:t>Horas aproximadas: [ ] horas</w:t>
             </w:r>
             <w:r>
               <w:rPr>
                 <w:i/>
                 <w:color w:val="6E6E6E"/>
               </w:rPr>
-              <w:t xml:space="preserve"> | [</w:t>
-            </w:r>
-            <w:proofErr w:type="spellStart"/>
-            <w:r>
-              <w:rPr>
-                <w:i/>
-                <w:color w:val="6E6E6E"/>
-              </w:rPr>
-              <w:t>Preencher</w:t>
-            </w:r>
-            <w:proofErr w:type="spellEnd"/>
-            <w:r>
-              <w:rPr>
-                <w:i/>
-                <w:color w:val="6E6E6E"/>
-              </w:rPr>
-              <w:t>]</w:t>
+              <w:t xml:space="preserve"> | [Preencher]</w:t>
             </w:r>
           </w:p>
         </w:tc>
@@ -6285,44 +4985,14 @@
               <w:rPr>
                 <w:b/>
               </w:rPr>
-              <w:t xml:space="preserve">Horas </w:t>
-            </w:r>
-            <w:proofErr w:type="spellStart"/>
-            <w:r>
-              <w:rPr>
-                <w:b/>
-              </w:rPr>
-              <w:t>aproximadas</w:t>
-            </w:r>
-            <w:proofErr w:type="spellEnd"/>
-            <w:r>
-              <w:rPr>
-                <w:b/>
-              </w:rPr>
-              <w:t>: [ ] horas</w:t>
+              <w:t>Horas aproximadas: [ ] horas</w:t>
             </w:r>
             <w:r>
               <w:rPr>
                 <w:i/>
                 <w:color w:val="6E6E6E"/>
               </w:rPr>
-              <w:t xml:space="preserve"> | [</w:t>
-            </w:r>
-            <w:proofErr w:type="spellStart"/>
-            <w:r>
-              <w:rPr>
-                <w:i/>
-                <w:color w:val="6E6E6E"/>
-              </w:rPr>
-              <w:t>Preencher</w:t>
-            </w:r>
-            <w:proofErr w:type="spellEnd"/>
-            <w:r>
-              <w:rPr>
-                <w:i/>
-                <w:color w:val="6E6E6E"/>
-              </w:rPr>
-              <w:t>]</w:t>
+              <w:t xml:space="preserve"> | [Preencher]</w:t>
             </w:r>
           </w:p>
         </w:tc>
@@ -6347,31 +5017,13 @@
             <w:pPr>
               <w:spacing w:after="0"/>
             </w:pPr>
-            <w:proofErr w:type="spellStart"/>
             <w:r>
               <w:rPr>
                 <w:b/>
                 <w:color w:val="1F4E79"/>
               </w:rPr>
-              <w:t>Sintese</w:t>
-            </w:r>
-            <w:proofErr w:type="spellEnd"/>
-            <w:r>
-              <w:rPr>
-                <w:b/>
-                <w:color w:val="1F4E79"/>
-              </w:rPr>
-              <w:t xml:space="preserve"> do </w:t>
-            </w:r>
-            <w:proofErr w:type="spellStart"/>
-            <w:r>
-              <w:rPr>
-                <w:b/>
-                <w:color w:val="1F4E79"/>
-              </w:rPr>
-              <w:t>grupo</w:t>
-            </w:r>
-            <w:proofErr w:type="spellEnd"/>
+              <w:t>Sintese do grupo</w:t>
+            </w:r>
           </w:p>
         </w:tc>
         <w:tc>
@@ -6395,23 +5047,7 @@
                 <w:i/>
                 <w:color w:val="6E6E6E"/>
               </w:rPr>
-              <w:t>[</w:t>
-            </w:r>
-            <w:proofErr w:type="spellStart"/>
-            <w:r>
-              <w:rPr>
-                <w:i/>
-                <w:color w:val="6E6E6E"/>
-              </w:rPr>
-              <w:t>Preencher</w:t>
-            </w:r>
-            <w:proofErr w:type="spellEnd"/>
-            <w:r>
-              <w:rPr>
-                <w:i/>
-                <w:color w:val="6E6E6E"/>
-              </w:rPr>
-              <w:t>]</w:t>
+              <w:t>[Preencher]</w:t>
             </w:r>
           </w:p>
         </w:tc>
@@ -6436,31 +5072,20 @@
             <w:pPr>
               <w:spacing w:after="0"/>
             </w:pPr>
-            <w:proofErr w:type="spellStart"/>
             <w:r>
               <w:rPr>
                 <w:b/>
                 <w:color w:val="1F4E79"/>
               </w:rPr>
-              <w:t>Próxima</w:t>
-            </w:r>
-            <w:proofErr w:type="spellEnd"/>
+              <w:t xml:space="preserve">Próxima </w:t>
+            </w:r>
             <w:r>
               <w:rPr>
                 <w:b/>
                 <w:color w:val="1F4E79"/>
               </w:rPr>
-              <w:t xml:space="preserve"> </w:t>
-            </w:r>
-            <w:proofErr w:type="spellStart"/>
-            <w:r>
-              <w:rPr>
-                <w:b/>
-                <w:color w:val="1F4E79"/>
-              </w:rPr>
               <w:t>semana</w:t>
             </w:r>
-            <w:proofErr w:type="spellEnd"/>
           </w:p>
         </w:tc>
         <w:tc>
@@ -6484,23 +5109,7 @@
                 <w:i/>
                 <w:color w:val="6E6E6E"/>
               </w:rPr>
-              <w:t>[</w:t>
-            </w:r>
-            <w:proofErr w:type="spellStart"/>
-            <w:r>
-              <w:rPr>
-                <w:i/>
-                <w:color w:val="6E6E6E"/>
-              </w:rPr>
-              <w:t>Preencher</w:t>
-            </w:r>
-            <w:proofErr w:type="spellEnd"/>
-            <w:r>
-              <w:rPr>
-                <w:i/>
-                <w:color w:val="6E6E6E"/>
-              </w:rPr>
-              <w:t>]</w:t>
+              <w:t>[Preencher]</w:t>
             </w:r>
           </w:p>
         </w:tc>
@@ -6577,31 +5186,13 @@
             <w:pPr>
               <w:spacing w:after="0"/>
             </w:pPr>
-            <w:proofErr w:type="spellStart"/>
             <w:r>
               <w:rPr>
                 <w:b/>
                 <w:color w:val="1F4E79"/>
               </w:rPr>
-              <w:t>Objetivo</w:t>
-            </w:r>
-            <w:proofErr w:type="spellEnd"/>
-            <w:r>
-              <w:rPr>
-                <w:b/>
-                <w:color w:val="1F4E79"/>
-              </w:rPr>
-              <w:t xml:space="preserve">(s) da </w:t>
-            </w:r>
-            <w:proofErr w:type="spellStart"/>
-            <w:r>
-              <w:rPr>
-                <w:b/>
-                <w:color w:val="1F4E79"/>
-              </w:rPr>
-              <w:t>semana</w:t>
-            </w:r>
-            <w:proofErr w:type="spellEnd"/>
+              <w:t>Objetivo(s) da semana</w:t>
+            </w:r>
           </w:p>
         </w:tc>
         <w:tc>
@@ -6625,23 +5216,7 @@
                 <w:i/>
                 <w:color w:val="6E6E6E"/>
               </w:rPr>
-              <w:t>[</w:t>
-            </w:r>
-            <w:proofErr w:type="spellStart"/>
-            <w:r>
-              <w:rPr>
-                <w:i/>
-                <w:color w:val="6E6E6E"/>
-              </w:rPr>
-              <w:t>Preencher</w:t>
-            </w:r>
-            <w:proofErr w:type="spellEnd"/>
-            <w:r>
-              <w:rPr>
-                <w:i/>
-                <w:color w:val="6E6E6E"/>
-              </w:rPr>
-              <w:t>]</w:t>
+              <w:t>[Preencher]</w:t>
             </w:r>
           </w:p>
         </w:tc>
@@ -6695,44 +5270,14 @@
               <w:rPr>
                 <w:b/>
               </w:rPr>
-              <w:t xml:space="preserve">Horas </w:t>
-            </w:r>
-            <w:proofErr w:type="spellStart"/>
-            <w:r>
-              <w:rPr>
-                <w:b/>
-              </w:rPr>
-              <w:t>aproximadas</w:t>
-            </w:r>
-            <w:proofErr w:type="spellEnd"/>
-            <w:r>
-              <w:rPr>
-                <w:b/>
-              </w:rPr>
-              <w:t>: [ ] horas</w:t>
+              <w:t>Horas aproximadas: [ ] horas</w:t>
             </w:r>
             <w:r>
               <w:rPr>
                 <w:i/>
                 <w:color w:val="6E6E6E"/>
               </w:rPr>
-              <w:t xml:space="preserve"> | [</w:t>
-            </w:r>
-            <w:proofErr w:type="spellStart"/>
-            <w:r>
-              <w:rPr>
-                <w:i/>
-                <w:color w:val="6E6E6E"/>
-              </w:rPr>
-              <w:t>Preencher</w:t>
-            </w:r>
-            <w:proofErr w:type="spellEnd"/>
-            <w:r>
-              <w:rPr>
-                <w:i/>
-                <w:color w:val="6E6E6E"/>
-              </w:rPr>
-              <w:t>]</w:t>
+              <w:t xml:space="preserve"> | [Preencher]</w:t>
             </w:r>
           </w:p>
         </w:tc>
@@ -6793,44 +5338,14 @@
               <w:rPr>
                 <w:b/>
               </w:rPr>
-              <w:t xml:space="preserve">Horas </w:t>
-            </w:r>
-            <w:proofErr w:type="spellStart"/>
-            <w:r>
-              <w:rPr>
-                <w:b/>
-              </w:rPr>
-              <w:t>aproximadas</w:t>
-            </w:r>
-            <w:proofErr w:type="spellEnd"/>
-            <w:r>
-              <w:rPr>
-                <w:b/>
-              </w:rPr>
-              <w:t>: [ ] horas</w:t>
+              <w:t>Horas aproximadas: [ ] horas</w:t>
             </w:r>
             <w:r>
               <w:rPr>
                 <w:i/>
                 <w:color w:val="6E6E6E"/>
               </w:rPr>
-              <w:t xml:space="preserve"> | [</w:t>
-            </w:r>
-            <w:proofErr w:type="spellStart"/>
-            <w:r>
-              <w:rPr>
-                <w:i/>
-                <w:color w:val="6E6E6E"/>
-              </w:rPr>
-              <w:t>Preencher</w:t>
-            </w:r>
-            <w:proofErr w:type="spellEnd"/>
-            <w:r>
-              <w:rPr>
-                <w:i/>
-                <w:color w:val="6E6E6E"/>
-              </w:rPr>
-              <w:t>]</w:t>
+              <w:t xml:space="preserve"> | [Preencher]</w:t>
             </w:r>
           </w:p>
         </w:tc>
@@ -6884,44 +5399,14 @@
               <w:rPr>
                 <w:b/>
               </w:rPr>
-              <w:t xml:space="preserve">Horas </w:t>
-            </w:r>
-            <w:proofErr w:type="spellStart"/>
-            <w:r>
-              <w:rPr>
-                <w:b/>
-              </w:rPr>
-              <w:t>aproximadas</w:t>
-            </w:r>
-            <w:proofErr w:type="spellEnd"/>
-            <w:r>
-              <w:rPr>
-                <w:b/>
-              </w:rPr>
-              <w:t>: [ ] horas</w:t>
+              <w:t>Horas aproximadas: [ ] horas</w:t>
             </w:r>
             <w:r>
               <w:rPr>
                 <w:i/>
                 <w:color w:val="6E6E6E"/>
               </w:rPr>
-              <w:t xml:space="preserve"> | [</w:t>
-            </w:r>
-            <w:proofErr w:type="spellStart"/>
-            <w:r>
-              <w:rPr>
-                <w:i/>
-                <w:color w:val="6E6E6E"/>
-              </w:rPr>
-              <w:t>Preencher</w:t>
-            </w:r>
-            <w:proofErr w:type="spellEnd"/>
-            <w:r>
-              <w:rPr>
-                <w:i/>
-                <w:color w:val="6E6E6E"/>
-              </w:rPr>
-              <w:t>]</w:t>
+              <w:t xml:space="preserve"> | [Preencher]</w:t>
             </w:r>
           </w:p>
         </w:tc>
@@ -6946,31 +5431,13 @@
             <w:pPr>
               <w:spacing w:after="0"/>
             </w:pPr>
-            <w:proofErr w:type="spellStart"/>
             <w:r>
               <w:rPr>
                 <w:b/>
                 <w:color w:val="1F4E79"/>
               </w:rPr>
-              <w:t>Sintese</w:t>
-            </w:r>
-            <w:proofErr w:type="spellEnd"/>
-            <w:r>
-              <w:rPr>
-                <w:b/>
-                <w:color w:val="1F4E79"/>
-              </w:rPr>
-              <w:t xml:space="preserve"> do </w:t>
-            </w:r>
-            <w:proofErr w:type="spellStart"/>
-            <w:r>
-              <w:rPr>
-                <w:b/>
-                <w:color w:val="1F4E79"/>
-              </w:rPr>
-              <w:t>grupo</w:t>
-            </w:r>
-            <w:proofErr w:type="spellEnd"/>
+              <w:t>Sintese do grupo</w:t>
+            </w:r>
           </w:p>
         </w:tc>
         <w:tc>
@@ -6994,23 +5461,7 @@
                 <w:i/>
                 <w:color w:val="6E6E6E"/>
               </w:rPr>
-              <w:t>[</w:t>
-            </w:r>
-            <w:proofErr w:type="spellStart"/>
-            <w:r>
-              <w:rPr>
-                <w:i/>
-                <w:color w:val="6E6E6E"/>
-              </w:rPr>
-              <w:t>Preencher</w:t>
-            </w:r>
-            <w:proofErr w:type="spellEnd"/>
-            <w:r>
-              <w:rPr>
-                <w:i/>
-                <w:color w:val="6E6E6E"/>
-              </w:rPr>
-              <w:t>]</w:t>
+              <w:t>[Preencher]</w:t>
             </w:r>
           </w:p>
         </w:tc>
@@ -7035,31 +5486,20 @@
             <w:pPr>
               <w:spacing w:after="0"/>
             </w:pPr>
-            <w:proofErr w:type="spellStart"/>
             <w:r>
               <w:rPr>
                 <w:b/>
                 <w:color w:val="1F4E79"/>
               </w:rPr>
-              <w:t>Próxima</w:t>
-            </w:r>
-            <w:proofErr w:type="spellEnd"/>
+              <w:t xml:space="preserve">Próxima </w:t>
+            </w:r>
             <w:r>
               <w:rPr>
                 <w:b/>
                 <w:color w:val="1F4E79"/>
               </w:rPr>
-              <w:t xml:space="preserve"> </w:t>
-            </w:r>
-            <w:proofErr w:type="spellStart"/>
-            <w:r>
-              <w:rPr>
-                <w:b/>
-                <w:color w:val="1F4E79"/>
-              </w:rPr>
               <w:t>semana</w:t>
             </w:r>
-            <w:proofErr w:type="spellEnd"/>
           </w:p>
         </w:tc>
         <w:tc>
@@ -7083,23 +5523,7 @@
                 <w:i/>
                 <w:color w:val="6E6E6E"/>
               </w:rPr>
-              <w:t>[</w:t>
-            </w:r>
-            <w:proofErr w:type="spellStart"/>
-            <w:r>
-              <w:rPr>
-                <w:i/>
-                <w:color w:val="6E6E6E"/>
-              </w:rPr>
-              <w:t>Preencher</w:t>
-            </w:r>
-            <w:proofErr w:type="spellEnd"/>
-            <w:r>
-              <w:rPr>
-                <w:i/>
-                <w:color w:val="6E6E6E"/>
-              </w:rPr>
-              <w:t>]</w:t>
+              <w:t>[Preencher]</w:t>
             </w:r>
           </w:p>
         </w:tc>
@@ -7178,31 +5602,13 @@
             <w:pPr>
               <w:spacing w:after="0"/>
             </w:pPr>
-            <w:proofErr w:type="spellStart"/>
             <w:r>
               <w:rPr>
                 <w:b/>
                 <w:color w:val="1F4E79"/>
               </w:rPr>
-              <w:t>Objetivo</w:t>
-            </w:r>
-            <w:proofErr w:type="spellEnd"/>
-            <w:r>
-              <w:rPr>
-                <w:b/>
-                <w:color w:val="1F4E79"/>
-              </w:rPr>
-              <w:t xml:space="preserve">(s) da </w:t>
-            </w:r>
-            <w:proofErr w:type="spellStart"/>
-            <w:r>
-              <w:rPr>
-                <w:b/>
-                <w:color w:val="1F4E79"/>
-              </w:rPr>
-              <w:t>semana</w:t>
-            </w:r>
-            <w:proofErr w:type="spellEnd"/>
+              <w:t>Objetivo(s) da semana</w:t>
+            </w:r>
           </w:p>
         </w:tc>
         <w:tc>
@@ -7226,23 +5632,7 @@
                 <w:i/>
                 <w:color w:val="6E6E6E"/>
               </w:rPr>
-              <w:t>[</w:t>
-            </w:r>
-            <w:proofErr w:type="spellStart"/>
-            <w:r>
-              <w:rPr>
-                <w:i/>
-                <w:color w:val="6E6E6E"/>
-              </w:rPr>
-              <w:t>Preencher</w:t>
-            </w:r>
-            <w:proofErr w:type="spellEnd"/>
-            <w:r>
-              <w:rPr>
-                <w:i/>
-                <w:color w:val="6E6E6E"/>
-              </w:rPr>
-              <w:t>]</w:t>
+              <w:t>[Preencher]</w:t>
             </w:r>
           </w:p>
         </w:tc>
@@ -7296,44 +5686,14 @@
               <w:rPr>
                 <w:b/>
               </w:rPr>
-              <w:t xml:space="preserve">Horas </w:t>
-            </w:r>
-            <w:proofErr w:type="spellStart"/>
-            <w:r>
-              <w:rPr>
-                <w:b/>
-              </w:rPr>
-              <w:t>aproximadas</w:t>
-            </w:r>
-            <w:proofErr w:type="spellEnd"/>
-            <w:r>
-              <w:rPr>
-                <w:b/>
-              </w:rPr>
-              <w:t>: [ ] horas</w:t>
+              <w:t>Horas aproximadas: [ ] horas</w:t>
             </w:r>
             <w:r>
               <w:rPr>
                 <w:i/>
                 <w:color w:val="6E6E6E"/>
               </w:rPr>
-              <w:t xml:space="preserve"> | [</w:t>
-            </w:r>
-            <w:proofErr w:type="spellStart"/>
-            <w:r>
-              <w:rPr>
-                <w:i/>
-                <w:color w:val="6E6E6E"/>
-              </w:rPr>
-              <w:t>Preencher</w:t>
-            </w:r>
-            <w:proofErr w:type="spellEnd"/>
-            <w:r>
-              <w:rPr>
-                <w:i/>
-                <w:color w:val="6E6E6E"/>
-              </w:rPr>
-              <w:t>]</w:t>
+              <w:t xml:space="preserve"> | [Preencher]</w:t>
             </w:r>
           </w:p>
         </w:tc>
@@ -7394,44 +5754,14 @@
               <w:rPr>
                 <w:b/>
               </w:rPr>
-              <w:t xml:space="preserve">Horas </w:t>
-            </w:r>
-            <w:proofErr w:type="spellStart"/>
-            <w:r>
-              <w:rPr>
-                <w:b/>
-              </w:rPr>
-              <w:t>aproximadas</w:t>
-            </w:r>
-            <w:proofErr w:type="spellEnd"/>
-            <w:r>
-              <w:rPr>
-                <w:b/>
-              </w:rPr>
-              <w:t>: [ ] horas</w:t>
+              <w:t>Horas aproximadas: [ ] horas</w:t>
             </w:r>
             <w:r>
               <w:rPr>
                 <w:i/>
                 <w:color w:val="6E6E6E"/>
               </w:rPr>
-              <w:t xml:space="preserve"> | [</w:t>
-            </w:r>
-            <w:proofErr w:type="spellStart"/>
-            <w:r>
-              <w:rPr>
-                <w:i/>
-                <w:color w:val="6E6E6E"/>
-              </w:rPr>
-              <w:t>Preencher</w:t>
-            </w:r>
-            <w:proofErr w:type="spellEnd"/>
-            <w:r>
-              <w:rPr>
-                <w:i/>
-                <w:color w:val="6E6E6E"/>
-              </w:rPr>
-              <w:t>]</w:t>
+              <w:t xml:space="preserve"> | [Preencher]</w:t>
             </w:r>
           </w:p>
         </w:tc>
@@ -7485,44 +5815,14 @@
               <w:rPr>
                 <w:b/>
               </w:rPr>
-              <w:t xml:space="preserve">Horas </w:t>
-            </w:r>
-            <w:proofErr w:type="spellStart"/>
-            <w:r>
-              <w:rPr>
-                <w:b/>
-              </w:rPr>
-              <w:t>aproximadas</w:t>
-            </w:r>
-            <w:proofErr w:type="spellEnd"/>
-            <w:r>
-              <w:rPr>
-                <w:b/>
-              </w:rPr>
-              <w:t>: [ ] horas</w:t>
+              <w:t>Horas aproximadas: [ ] horas</w:t>
             </w:r>
             <w:r>
               <w:rPr>
                 <w:i/>
                 <w:color w:val="6E6E6E"/>
               </w:rPr>
-              <w:t xml:space="preserve"> | [</w:t>
-            </w:r>
-            <w:proofErr w:type="spellStart"/>
-            <w:r>
-              <w:rPr>
-                <w:i/>
-                <w:color w:val="6E6E6E"/>
-              </w:rPr>
-              <w:t>Preencher</w:t>
-            </w:r>
-            <w:proofErr w:type="spellEnd"/>
-            <w:r>
-              <w:rPr>
-                <w:i/>
-                <w:color w:val="6E6E6E"/>
-              </w:rPr>
-              <w:t>]</w:t>
+              <w:t xml:space="preserve"> | [Preencher]</w:t>
             </w:r>
           </w:p>
         </w:tc>
@@ -7547,31 +5847,13 @@
             <w:pPr>
               <w:spacing w:after="0"/>
             </w:pPr>
-            <w:proofErr w:type="spellStart"/>
             <w:r>
               <w:rPr>
                 <w:b/>
                 <w:color w:val="1F4E79"/>
               </w:rPr>
-              <w:t>Sintese</w:t>
-            </w:r>
-            <w:proofErr w:type="spellEnd"/>
-            <w:r>
-              <w:rPr>
-                <w:b/>
-                <w:color w:val="1F4E79"/>
-              </w:rPr>
-              <w:t xml:space="preserve"> do </w:t>
-            </w:r>
-            <w:proofErr w:type="spellStart"/>
-            <w:r>
-              <w:rPr>
-                <w:b/>
-                <w:color w:val="1F4E79"/>
-              </w:rPr>
-              <w:t>grupo</w:t>
-            </w:r>
-            <w:proofErr w:type="spellEnd"/>
+              <w:t>Sintese do grupo</w:t>
+            </w:r>
           </w:p>
         </w:tc>
         <w:tc>
@@ -7595,23 +5877,7 @@
                 <w:i/>
                 <w:color w:val="6E6E6E"/>
               </w:rPr>
-              <w:t>[</w:t>
-            </w:r>
-            <w:proofErr w:type="spellStart"/>
-            <w:r>
-              <w:rPr>
-                <w:i/>
-                <w:color w:val="6E6E6E"/>
-              </w:rPr>
-              <w:t>Preencher</w:t>
-            </w:r>
-            <w:proofErr w:type="spellEnd"/>
-            <w:r>
-              <w:rPr>
-                <w:i/>
-                <w:color w:val="6E6E6E"/>
-              </w:rPr>
-              <w:t>]</w:t>
+              <w:t>[Preencher]</w:t>
             </w:r>
           </w:p>
         </w:tc>
@@ -7636,31 +5902,20 @@
             <w:pPr>
               <w:spacing w:after="0"/>
             </w:pPr>
-            <w:proofErr w:type="spellStart"/>
             <w:r>
               <w:rPr>
                 <w:b/>
                 <w:color w:val="1F4E79"/>
               </w:rPr>
-              <w:t>Próxima</w:t>
-            </w:r>
-            <w:proofErr w:type="spellEnd"/>
+              <w:t xml:space="preserve">Próxima </w:t>
+            </w:r>
             <w:r>
               <w:rPr>
                 <w:b/>
                 <w:color w:val="1F4E79"/>
               </w:rPr>
-              <w:t xml:space="preserve"> </w:t>
-            </w:r>
-            <w:proofErr w:type="spellStart"/>
-            <w:r>
-              <w:rPr>
-                <w:b/>
-                <w:color w:val="1F4E79"/>
-              </w:rPr>
               <w:t>semana</w:t>
             </w:r>
-            <w:proofErr w:type="spellEnd"/>
           </w:p>
         </w:tc>
         <w:tc>
@@ -7684,23 +5939,7 @@
                 <w:i/>
                 <w:color w:val="6E6E6E"/>
               </w:rPr>
-              <w:t>[</w:t>
-            </w:r>
-            <w:proofErr w:type="spellStart"/>
-            <w:r>
-              <w:rPr>
-                <w:i/>
-                <w:color w:val="6E6E6E"/>
-              </w:rPr>
-              <w:t>Preencher</w:t>
-            </w:r>
-            <w:proofErr w:type="spellEnd"/>
-            <w:r>
-              <w:rPr>
-                <w:i/>
-                <w:color w:val="6E6E6E"/>
-              </w:rPr>
-              <w:t>]</w:t>
+              <w:t>[Preencher]</w:t>
             </w:r>
           </w:p>
         </w:tc>
@@ -7771,31 +6010,13 @@
             <w:pPr>
               <w:spacing w:after="0"/>
             </w:pPr>
-            <w:proofErr w:type="spellStart"/>
             <w:r>
               <w:rPr>
                 <w:b/>
                 <w:color w:val="1F4E79"/>
               </w:rPr>
-              <w:t>Objetivo</w:t>
-            </w:r>
-            <w:proofErr w:type="spellEnd"/>
-            <w:r>
-              <w:rPr>
-                <w:b/>
-                <w:color w:val="1F4E79"/>
-              </w:rPr>
-              <w:t xml:space="preserve">(s) da </w:t>
-            </w:r>
-            <w:proofErr w:type="spellStart"/>
-            <w:r>
-              <w:rPr>
-                <w:b/>
-                <w:color w:val="1F4E79"/>
-              </w:rPr>
-              <w:t>semana</w:t>
-            </w:r>
-            <w:proofErr w:type="spellEnd"/>
+              <w:t>Objetivo(s) da semana</w:t>
+            </w:r>
           </w:p>
         </w:tc>
         <w:tc>
@@ -7819,23 +6040,7 @@
                 <w:i/>
                 <w:color w:val="6E6E6E"/>
               </w:rPr>
-              <w:t>[</w:t>
-            </w:r>
-            <w:proofErr w:type="spellStart"/>
-            <w:r>
-              <w:rPr>
-                <w:i/>
-                <w:color w:val="6E6E6E"/>
-              </w:rPr>
-              <w:t>Preencher</w:t>
-            </w:r>
-            <w:proofErr w:type="spellEnd"/>
-            <w:r>
-              <w:rPr>
-                <w:i/>
-                <w:color w:val="6E6E6E"/>
-              </w:rPr>
-              <w:t>]</w:t>
+              <w:t>[Preencher]</w:t>
             </w:r>
           </w:p>
         </w:tc>
@@ -7889,44 +6094,14 @@
               <w:rPr>
                 <w:b/>
               </w:rPr>
-              <w:t xml:space="preserve">Horas </w:t>
-            </w:r>
-            <w:proofErr w:type="spellStart"/>
-            <w:r>
-              <w:rPr>
-                <w:b/>
-              </w:rPr>
-              <w:t>aproximadas</w:t>
-            </w:r>
-            <w:proofErr w:type="spellEnd"/>
-            <w:r>
-              <w:rPr>
-                <w:b/>
-              </w:rPr>
-              <w:t>: [ ] horas</w:t>
+              <w:t>Horas aproximadas: [ ] horas</w:t>
             </w:r>
             <w:r>
               <w:rPr>
                 <w:i/>
                 <w:color w:val="6E6E6E"/>
               </w:rPr>
-              <w:t xml:space="preserve"> | [</w:t>
-            </w:r>
-            <w:proofErr w:type="spellStart"/>
-            <w:r>
-              <w:rPr>
-                <w:i/>
-                <w:color w:val="6E6E6E"/>
-              </w:rPr>
-              <w:t>Preencher</w:t>
-            </w:r>
-            <w:proofErr w:type="spellEnd"/>
-            <w:r>
-              <w:rPr>
-                <w:i/>
-                <w:color w:val="6E6E6E"/>
-              </w:rPr>
-              <w:t>]</w:t>
+              <w:t xml:space="preserve"> | [Preencher]</w:t>
             </w:r>
           </w:p>
         </w:tc>
@@ -7987,44 +6162,14 @@
               <w:rPr>
                 <w:b/>
               </w:rPr>
-              <w:t xml:space="preserve">Horas </w:t>
-            </w:r>
-            <w:proofErr w:type="spellStart"/>
-            <w:r>
-              <w:rPr>
-                <w:b/>
-              </w:rPr>
-              <w:t>aproximadas</w:t>
-            </w:r>
-            <w:proofErr w:type="spellEnd"/>
-            <w:r>
-              <w:rPr>
-                <w:b/>
-              </w:rPr>
-              <w:t>: [ ] horas</w:t>
+              <w:t>Horas aproximadas: [ ] horas</w:t>
             </w:r>
             <w:r>
               <w:rPr>
                 <w:i/>
                 <w:color w:val="6E6E6E"/>
               </w:rPr>
-              <w:t xml:space="preserve"> | [</w:t>
-            </w:r>
-            <w:proofErr w:type="spellStart"/>
-            <w:r>
-              <w:rPr>
-                <w:i/>
-                <w:color w:val="6E6E6E"/>
-              </w:rPr>
-              <w:t>Preencher</w:t>
-            </w:r>
-            <w:proofErr w:type="spellEnd"/>
-            <w:r>
-              <w:rPr>
-                <w:i/>
-                <w:color w:val="6E6E6E"/>
-              </w:rPr>
-              <w:t>]</w:t>
+              <w:t xml:space="preserve"> | [Preencher]</w:t>
             </w:r>
           </w:p>
         </w:tc>
@@ -8078,44 +6223,14 @@
               <w:rPr>
                 <w:b/>
               </w:rPr>
-              <w:t xml:space="preserve">Horas </w:t>
-            </w:r>
-            <w:proofErr w:type="spellStart"/>
-            <w:r>
-              <w:rPr>
-                <w:b/>
-              </w:rPr>
-              <w:t>aproximadas</w:t>
-            </w:r>
-            <w:proofErr w:type="spellEnd"/>
-            <w:r>
-              <w:rPr>
-                <w:b/>
-              </w:rPr>
-              <w:t>: [ ] horas</w:t>
+              <w:t>Horas aproximadas: [ ] horas</w:t>
             </w:r>
             <w:r>
               <w:rPr>
                 <w:i/>
                 <w:color w:val="6E6E6E"/>
               </w:rPr>
-              <w:t xml:space="preserve"> | [</w:t>
-            </w:r>
-            <w:proofErr w:type="spellStart"/>
-            <w:r>
-              <w:rPr>
-                <w:i/>
-                <w:color w:val="6E6E6E"/>
-              </w:rPr>
-              <w:t>Preencher</w:t>
-            </w:r>
-            <w:proofErr w:type="spellEnd"/>
-            <w:r>
-              <w:rPr>
-                <w:i/>
-                <w:color w:val="6E6E6E"/>
-              </w:rPr>
-              <w:t>]</w:t>
+              <w:t xml:space="preserve"> | [Preencher]</w:t>
             </w:r>
           </w:p>
         </w:tc>
@@ -8140,31 +6255,13 @@
             <w:pPr>
               <w:spacing w:after="0"/>
             </w:pPr>
-            <w:proofErr w:type="spellStart"/>
             <w:r>
               <w:rPr>
                 <w:b/>
                 <w:color w:val="1F4E79"/>
               </w:rPr>
-              <w:t>Sintese</w:t>
-            </w:r>
-            <w:proofErr w:type="spellEnd"/>
-            <w:r>
-              <w:rPr>
-                <w:b/>
-                <w:color w:val="1F4E79"/>
-              </w:rPr>
-              <w:t xml:space="preserve"> do </w:t>
-            </w:r>
-            <w:proofErr w:type="spellStart"/>
-            <w:r>
-              <w:rPr>
-                <w:b/>
-                <w:color w:val="1F4E79"/>
-              </w:rPr>
-              <w:t>grupo</w:t>
-            </w:r>
-            <w:proofErr w:type="spellEnd"/>
+              <w:t>Sintese do grupo</w:t>
+            </w:r>
           </w:p>
         </w:tc>
         <w:tc>
@@ -8188,23 +6285,7 @@
                 <w:i/>
                 <w:color w:val="6E6E6E"/>
               </w:rPr>
-              <w:t>[</w:t>
-            </w:r>
-            <w:proofErr w:type="spellStart"/>
-            <w:r>
-              <w:rPr>
-                <w:i/>
-                <w:color w:val="6E6E6E"/>
-              </w:rPr>
-              <w:t>Preencher</w:t>
-            </w:r>
-            <w:proofErr w:type="spellEnd"/>
-            <w:r>
-              <w:rPr>
-                <w:i/>
-                <w:color w:val="6E6E6E"/>
-              </w:rPr>
-              <w:t>]</w:t>
+              <w:t>[Preencher]</w:t>
             </w:r>
           </w:p>
         </w:tc>
@@ -8229,31 +6310,20 @@
             <w:pPr>
               <w:spacing w:after="0"/>
             </w:pPr>
-            <w:proofErr w:type="spellStart"/>
             <w:r>
               <w:rPr>
                 <w:b/>
                 <w:color w:val="1F4E79"/>
               </w:rPr>
-              <w:t>Próxima</w:t>
-            </w:r>
-            <w:proofErr w:type="spellEnd"/>
+              <w:t xml:space="preserve">Próxima </w:t>
+            </w:r>
             <w:r>
               <w:rPr>
                 <w:b/>
                 <w:color w:val="1F4E79"/>
               </w:rPr>
-              <w:t xml:space="preserve"> </w:t>
-            </w:r>
-            <w:proofErr w:type="spellStart"/>
-            <w:r>
-              <w:rPr>
-                <w:b/>
-                <w:color w:val="1F4E79"/>
-              </w:rPr>
               <w:t>semana</w:t>
             </w:r>
-            <w:proofErr w:type="spellEnd"/>
           </w:p>
         </w:tc>
         <w:tc>
@@ -8277,23 +6347,7 @@
                 <w:i/>
                 <w:color w:val="6E6E6E"/>
               </w:rPr>
-              <w:t>[</w:t>
-            </w:r>
-            <w:proofErr w:type="spellStart"/>
-            <w:r>
-              <w:rPr>
-                <w:i/>
-                <w:color w:val="6E6E6E"/>
-              </w:rPr>
-              <w:t>Preencher</w:t>
-            </w:r>
-            <w:proofErr w:type="spellEnd"/>
-            <w:r>
-              <w:rPr>
-                <w:i/>
-                <w:color w:val="6E6E6E"/>
-              </w:rPr>
-              <w:t>]</w:t>
+              <w:t>[Preencher]</w:t>
             </w:r>
           </w:p>
         </w:tc>
@@ -8364,31 +6418,13 @@
             <w:pPr>
               <w:spacing w:after="0"/>
             </w:pPr>
-            <w:proofErr w:type="spellStart"/>
             <w:r>
               <w:rPr>
                 <w:b/>
                 <w:color w:val="1F4E79"/>
               </w:rPr>
-              <w:t>Objetivo</w:t>
-            </w:r>
-            <w:proofErr w:type="spellEnd"/>
-            <w:r>
-              <w:rPr>
-                <w:b/>
-                <w:color w:val="1F4E79"/>
-              </w:rPr>
-              <w:t xml:space="preserve">(s) da </w:t>
-            </w:r>
-            <w:proofErr w:type="spellStart"/>
-            <w:r>
-              <w:rPr>
-                <w:b/>
-                <w:color w:val="1F4E79"/>
-              </w:rPr>
-              <w:t>semana</w:t>
-            </w:r>
-            <w:proofErr w:type="spellEnd"/>
+              <w:t>Objetivo(s) da semana</w:t>
+            </w:r>
           </w:p>
         </w:tc>
         <w:tc>
@@ -8412,23 +6448,7 @@
                 <w:i/>
                 <w:color w:val="6E6E6E"/>
               </w:rPr>
-              <w:t>[</w:t>
-            </w:r>
-            <w:proofErr w:type="spellStart"/>
-            <w:r>
-              <w:rPr>
-                <w:i/>
-                <w:color w:val="6E6E6E"/>
-              </w:rPr>
-              <w:t>Preencher</w:t>
-            </w:r>
-            <w:proofErr w:type="spellEnd"/>
-            <w:r>
-              <w:rPr>
-                <w:i/>
-                <w:color w:val="6E6E6E"/>
-              </w:rPr>
-              <w:t>]</w:t>
+              <w:t>[Preencher]</w:t>
             </w:r>
           </w:p>
         </w:tc>
@@ -8482,44 +6502,14 @@
               <w:rPr>
                 <w:b/>
               </w:rPr>
-              <w:t xml:space="preserve">Horas </w:t>
-            </w:r>
-            <w:proofErr w:type="spellStart"/>
-            <w:r>
-              <w:rPr>
-                <w:b/>
-              </w:rPr>
-              <w:t>aproximadas</w:t>
-            </w:r>
-            <w:proofErr w:type="spellEnd"/>
-            <w:r>
-              <w:rPr>
-                <w:b/>
-              </w:rPr>
-              <w:t>: [ ] horas</w:t>
+              <w:t>Horas aproximadas: [ ] horas</w:t>
             </w:r>
             <w:r>
               <w:rPr>
                 <w:i/>
                 <w:color w:val="6E6E6E"/>
               </w:rPr>
-              <w:t xml:space="preserve"> | [</w:t>
-            </w:r>
-            <w:proofErr w:type="spellStart"/>
-            <w:r>
-              <w:rPr>
-                <w:i/>
-                <w:color w:val="6E6E6E"/>
-              </w:rPr>
-              <w:t>Preencher</w:t>
-            </w:r>
-            <w:proofErr w:type="spellEnd"/>
-            <w:r>
-              <w:rPr>
-                <w:i/>
-                <w:color w:val="6E6E6E"/>
-              </w:rPr>
-              <w:t>]</w:t>
+              <w:t xml:space="preserve"> | [Preencher]</w:t>
             </w:r>
           </w:p>
         </w:tc>
@@ -8580,44 +6570,14 @@
               <w:rPr>
                 <w:b/>
               </w:rPr>
-              <w:t xml:space="preserve">Horas </w:t>
-            </w:r>
-            <w:proofErr w:type="spellStart"/>
-            <w:r>
-              <w:rPr>
-                <w:b/>
-              </w:rPr>
-              <w:t>aproximadas</w:t>
-            </w:r>
-            <w:proofErr w:type="spellEnd"/>
-            <w:r>
-              <w:rPr>
-                <w:b/>
-              </w:rPr>
-              <w:t>: [ ] horas</w:t>
+              <w:t>Horas aproximadas: [ ] horas</w:t>
             </w:r>
             <w:r>
               <w:rPr>
                 <w:i/>
                 <w:color w:val="6E6E6E"/>
               </w:rPr>
-              <w:t xml:space="preserve"> | [</w:t>
-            </w:r>
-            <w:proofErr w:type="spellStart"/>
-            <w:r>
-              <w:rPr>
-                <w:i/>
-                <w:color w:val="6E6E6E"/>
-              </w:rPr>
-              <w:t>Preencher</w:t>
-            </w:r>
-            <w:proofErr w:type="spellEnd"/>
-            <w:r>
-              <w:rPr>
-                <w:i/>
-                <w:color w:val="6E6E6E"/>
-              </w:rPr>
-              <w:t>]</w:t>
+              <w:t xml:space="preserve"> | [Preencher]</w:t>
             </w:r>
           </w:p>
         </w:tc>
@@ -8671,44 +6631,14 @@
               <w:rPr>
                 <w:b/>
               </w:rPr>
-              <w:t xml:space="preserve">Horas </w:t>
-            </w:r>
-            <w:proofErr w:type="spellStart"/>
-            <w:r>
-              <w:rPr>
-                <w:b/>
-              </w:rPr>
-              <w:t>aproximadas</w:t>
-            </w:r>
-            <w:proofErr w:type="spellEnd"/>
-            <w:r>
-              <w:rPr>
-                <w:b/>
-              </w:rPr>
-              <w:t>: [ ] horas</w:t>
+              <w:t>Horas aproximadas: [ ] horas</w:t>
             </w:r>
             <w:r>
               <w:rPr>
                 <w:i/>
                 <w:color w:val="6E6E6E"/>
               </w:rPr>
-              <w:t xml:space="preserve"> | [</w:t>
-            </w:r>
-            <w:proofErr w:type="spellStart"/>
-            <w:r>
-              <w:rPr>
-                <w:i/>
-                <w:color w:val="6E6E6E"/>
-              </w:rPr>
-              <w:t>Preencher</w:t>
-            </w:r>
-            <w:proofErr w:type="spellEnd"/>
-            <w:r>
-              <w:rPr>
-                <w:i/>
-                <w:color w:val="6E6E6E"/>
-              </w:rPr>
-              <w:t>]</w:t>
+              <w:t xml:space="preserve"> | [Preencher]</w:t>
             </w:r>
           </w:p>
         </w:tc>
@@ -8733,31 +6663,13 @@
             <w:pPr>
               <w:spacing w:after="0"/>
             </w:pPr>
-            <w:proofErr w:type="spellStart"/>
             <w:r>
               <w:rPr>
                 <w:b/>
                 <w:color w:val="1F4E79"/>
               </w:rPr>
-              <w:t>Sintese</w:t>
-            </w:r>
-            <w:proofErr w:type="spellEnd"/>
-            <w:r>
-              <w:rPr>
-                <w:b/>
-                <w:color w:val="1F4E79"/>
-              </w:rPr>
-              <w:t xml:space="preserve"> do </w:t>
-            </w:r>
-            <w:proofErr w:type="spellStart"/>
-            <w:r>
-              <w:rPr>
-                <w:b/>
-                <w:color w:val="1F4E79"/>
-              </w:rPr>
-              <w:t>grupo</w:t>
-            </w:r>
-            <w:proofErr w:type="spellEnd"/>
+              <w:t>Sintese do grupo</w:t>
+            </w:r>
           </w:p>
         </w:tc>
         <w:tc>
@@ -8781,23 +6693,7 @@
                 <w:i/>
                 <w:color w:val="6E6E6E"/>
               </w:rPr>
-              <w:t>[</w:t>
-            </w:r>
-            <w:proofErr w:type="spellStart"/>
-            <w:r>
-              <w:rPr>
-                <w:i/>
-                <w:color w:val="6E6E6E"/>
-              </w:rPr>
-              <w:t>Preencher</w:t>
-            </w:r>
-            <w:proofErr w:type="spellEnd"/>
-            <w:r>
-              <w:rPr>
-                <w:i/>
-                <w:color w:val="6E6E6E"/>
-              </w:rPr>
-              <w:t>]</w:t>
+              <w:t>[Preencher]</w:t>
             </w:r>
           </w:p>
         </w:tc>
@@ -8822,31 +6718,20 @@
             <w:pPr>
               <w:spacing w:after="0"/>
             </w:pPr>
-            <w:proofErr w:type="spellStart"/>
             <w:r>
               <w:rPr>
                 <w:b/>
                 <w:color w:val="1F4E79"/>
               </w:rPr>
-              <w:t>Próxima</w:t>
-            </w:r>
-            <w:proofErr w:type="spellEnd"/>
+              <w:t xml:space="preserve">Próxima </w:t>
+            </w:r>
             <w:r>
               <w:rPr>
                 <w:b/>
                 <w:color w:val="1F4E79"/>
               </w:rPr>
-              <w:t xml:space="preserve"> </w:t>
-            </w:r>
-            <w:proofErr w:type="spellStart"/>
-            <w:r>
-              <w:rPr>
-                <w:b/>
-                <w:color w:val="1F4E79"/>
-              </w:rPr>
               <w:t>semana</w:t>
             </w:r>
-            <w:proofErr w:type="spellEnd"/>
           </w:p>
         </w:tc>
         <w:tc>
@@ -8870,23 +6755,7 @@
                 <w:i/>
                 <w:color w:val="6E6E6E"/>
               </w:rPr>
-              <w:t>[</w:t>
-            </w:r>
-            <w:proofErr w:type="spellStart"/>
-            <w:r>
-              <w:rPr>
-                <w:i/>
-                <w:color w:val="6E6E6E"/>
-              </w:rPr>
-              <w:t>Preencher</w:t>
-            </w:r>
-            <w:proofErr w:type="spellEnd"/>
-            <w:r>
-              <w:rPr>
-                <w:i/>
-                <w:color w:val="6E6E6E"/>
-              </w:rPr>
-              <w:t>]</w:t>
+              <w:t>[Preencher]</w:t>
             </w:r>
           </w:p>
         </w:tc>
@@ -8899,60 +6768,11 @@
     </w:p>
     <w:p>
       <w:pPr>
-        <w:spacing w:after="10"/>
-      </w:pPr>
-    </w:p>
-    <w:p>
-      <w:pPr>
-        <w:spacing w:after="40"/>
-      </w:pPr>
-      <w:proofErr w:type="spellStart"/>
-      <w:r>
-        <w:rPr>
-          <w:b/>
-          <w:color w:val="1F4E79"/>
-          <w:sz w:val="27"/>
-        </w:rPr>
-        <w:t>Observaçõ</w:t>
-      </w:r>
-      <w:r>
-        <w:rPr>
-          <w:b/>
-          <w:color w:val="1F4E79"/>
-          <w:sz w:val="27"/>
-        </w:rPr>
-        <w:t>es</w:t>
-      </w:r>
-      <w:proofErr w:type="spellEnd"/>
-      <w:r>
-        <w:rPr>
-          <w:b/>
-          <w:color w:val="1F4E79"/>
-          <w:sz w:val="27"/>
-        </w:rPr>
-        <w:t xml:space="preserve"> </w:t>
-      </w:r>
-      <w:proofErr w:type="spellStart"/>
-      <w:r>
-        <w:rPr>
-          <w:b/>
-          <w:color w:val="1F4E79"/>
-          <w:sz w:val="27"/>
-        </w:rPr>
-        <w:t>finais</w:t>
-      </w:r>
-      <w:proofErr w:type="spellEnd"/>
-    </w:p>
-    <w:p>
-      <w:pPr>
         <w:spacing w:after="0"/>
         <w:rPr>
           <w:lang w:val="pt-PT"/>
         </w:rPr>
       </w:pPr>
-      <w:r>
-        <w:t>Sempre que relevante, podem ser acrescentadas notas sobre reuniões com o orientador, decisões metodológicas ou alterações ao planeamento. Até à reunião de 24/04/2026, o presente caderno reflete o trabalho realizado até 23/04/2026, incluindo a semana em curso como ponto de situação intermédio.</w:t>
-      </w:r>
     </w:p>
     <w:sectPr>
       <w:pgSz w:w="12240" w:h="15840"/>

</xml_diff>